<commit_message>
Refactor H2: add negotiator-structure tests
Unify and refactor Hypothesis 2 to model the joint judged-plus-counterpart negotiator structure. Added R/hypotheses/H2_test.R to run H2 separately for Victim and Bystander subsets (models A & B) and deprecated H2a/H2b wrappers to redirect to the new script. Introduced h2 relational helpers and column generation (add_h2_relational_structure_columns, dummy/label functions) in utils and updated variable generation so each vignette yields two negotiator-level judgment rows. Updated hypothesis metadata, report generation, plain-language guide, and pipeline invocation to use the new H2 specification; regenerated related outputs/models/figures and fit-stat handling to accept H2 filenames.
</commit_message>
<xml_diff>
--- a/outputs/report/tobit_analysis_report.docx
+++ b/outputs/report/tobit_analysis_report.docx
@@ -2,7 +2,7 @@
 <file path=word/document.xml><?xml version="1.0" encoding="utf-8"?>
 <w:document xmlns:w="http://schemas.openxmlformats.org/wordprocessingml/2006/main" xmlns:m="http://schemas.openxmlformats.org/officeDocument/2006/math" xmlns:r="http://schemas.openxmlformats.org/officeDocument/2006/relationships" xmlns:o="urn:schemas-microsoft-com:office:office" xmlns:v="urn:schemas-microsoft-com:vml" xmlns:w10="urn:schemas-microsoft-com:office:word" xmlns:a="http://schemas.openxmlformats.org/drawingml/2006/main" xmlns:pic="http://schemas.openxmlformats.org/drawingml/2006/picture" xmlns:wp="http://schemas.openxmlformats.org/drawingml/2006/wordprocessingDrawing">
   <w:body>
-    <w:bookmarkStart w:id="115" w:name="Xd4949d05ddf1f984e0b797806952ce6dfbf601b"/>
+    <w:bookmarkStart w:id="143" w:name="Xd4949d05ddf1f984e0b797806952ce6dfbf601b"/>
     <w:p>
       <w:pPr>
         <w:pStyle w:val="Heading1"/>
@@ -25,7 +25,7 @@
         <w:pStyle w:val="FirstParagraph"/>
       </w:pPr>
       <w:r>
-        <w:t xml:space="preserve">The empirical foundation of this project rests on two primary experimental datasets: FLORIDA and BUC. The sample consists of students from both the Floridablanca and Bucaramanga Campuses. These datasets capture incentivized moral judgments from distinct socio-economic contexts. Participants were presented with standardized negotiation scenarios where a negotiator’s decision resulted in varying degrees of payoff for themselves, their own group, and a victim group. Under Option 2: judgment-level relational modeling , each judgment is treated as relational and linked both to a descriptive victim x negotiator scenario shorthand and to hypothesis-specific predictors for judged negotiator status, decision outcome, and additional relational controls.</w:t>
+        <w:t xml:space="preserve">The empirical foundation of this project rests on two primary experimental datasets: FLORIDA and BUC. The sample consists of students from the Bucaramanga Campus. These datasets capture incentivized moral judgments from distinct socio-economic contexts. Participants were presented with standardized negotiation scenarios where a negotiator’s decision resulted in varying degrees of payoff for themselves, their own group, and a victim group. Under Option 2: judgment-level relational modeling , each judgment is treated as relational and linked both to a descriptive victim x negotiator scenario shorthand and to hypothesis-specific predictors for negotiator-side structure, observer-side victim alignment when applicable, and additional relational controls.</w:t>
       </w:r>
     </w:p>
     <w:bookmarkEnd w:id="9"/>
@@ -385,7 +385,7 @@
               <w:pStyle w:val="Compact"/>
             </w:pPr>
             <w:r>
-              <w:t xml:space="preserve">None</w:t>
+              <w:t xml:space="preserve">Negotiator-side structure: judged negotiator ingroup, counterpart negotiator outgroup (ref = judged negotiator ingroup, counterpart negotiator ingroup) x Player-victim outgroup (ref = ingroup victim)*; Negotiator-side structure: judged negotiator outgroup, counterpart negotiator ingroup (ref = judged negotiator ingroup, counterpart negotiator ingroup)+</w:t>
             </w:r>
           </w:p>
         </w:tc>
@@ -417,7 +417,7 @@
     </w:tbl>
     <w:bookmarkEnd w:id="12"/>
     <w:bookmarkEnd w:id="13"/>
-    <w:bookmarkStart w:id="40" w:name="significance-driven-figures"/>
+    <w:bookmarkStart w:id="47" w:name="significance-driven-figures"/>
     <w:p>
       <w:pPr>
         <w:pStyle w:val="Heading2"/>
@@ -726,13 +726,13 @@
       </w:r>
     </w:p>
     <w:bookmarkEnd w:id="26"/>
-    <w:bookmarkStart w:id="39" w:name="h3-empathy-x-judged-status-moderation"/>
+    <w:bookmarkStart w:id="33" w:name="h2-negotiator-side-relational-structure"/>
     <w:p>
       <w:pPr>
         <w:pStyle w:val="Heading3"/>
       </w:pPr>
       <w:r>
-        <w:t xml:space="preserve">H3: Empathy x judged-status moderation</w:t>
+        <w:t xml:space="preserve">H2: Negotiator-side relational structure</w:t>
       </w:r>
     </w:p>
     <w:p>
@@ -740,7 +740,7 @@
         <w:pStyle w:val="FirstParagraph"/>
       </w:pPr>
       <w:r>
-        <w:t xml:space="preserve">Empathy x judged negotiator control label hidden is statistically significant in the Tobit model (**, p = 0.007). The figure below shows that the predicted relationship rises most sharply for Empathy composite (average) when the condition is Judged negotiator control label hidden.</w:t>
+        <w:t xml:space="preserve">Negotiator-side structure: judged negotiator ingroup, counterpart negotiator outgroup (ref = judged negotiator ingroup, counterpart negotiator ingroup) x Player-victim outgroup (ref = ingroup victim) is statistically significant in the Tobit model (*, p = 0.030). The figure below shows that the predicted relationship rises most sharply for Negotiator-side structure: judged negotiator ingroup, counterpart negotiator outgroup (ref = judged negotiator ingroup, counterpart negotiator ingroup) when the condition is Player and victim outgroup-aligned.</w:t>
       </w:r>
     </w:p>
     <w:p>
@@ -752,12 +752,12 @@
           <wp:inline>
             <wp:extent cx="5334000" cy="4000500"/>
             <wp:effectExtent b="0" l="0" r="0" t="0"/>
-            <wp:docPr descr="Interaction Plot for Empathy x judged negotiator control label hidden in H3: Empathy x judged-status moderation. The panels show predicted judgments on the observed -9 to 9 scale with 95% confidence intervals." title="" id="28" name="Picture"/>
+            <wp:docPr descr="Interaction Plot for Negotiator-side structure: judged negotiator ingroup, counterpart negotiator outgroup (ref = judged negotiator ingroup, counterpart negotiator ingroup) x Player-victim outgroup (ref = ingroup victim) in H2: Negotiator-side relational structure. The panels show predicted judgments on the observed -9 to 9 scale with 95% confidence intervals." title="" id="28" name="Picture"/>
             <a:graphic>
               <a:graphicData uri="http://schemas.openxmlformats.org/drawingml/2006/picture">
                 <pic:pic>
                   <pic:nvPicPr>
-                    <pic:cNvPr descr="../figures/figure_sig_H3_iri_total_judged_control_h3_empathy_x_judged_negotiator_control_label_hidden.png" id="29" name="Picture"/>
+                    <pic:cNvPr descr="../figures/figure_sig_H2_h2_negstruct_j_in_c_out_player_victim_outgroup_h2_negotiator_side_structure_judged_negotiator_ingroup_counterpart_negotiator_outgroup_ref.png" id="29" name="Picture"/>
                     <pic:cNvPicPr>
                       <a:picLocks noChangeArrowheads="1" noChangeAspect="1"/>
                     </pic:cNvPicPr>
@@ -795,7 +795,7 @@
         <w:pStyle w:val="ImageCaption"/>
       </w:pPr>
       <w:r>
-        <w:t xml:space="preserve">Interaction Plot for Empathy x judged negotiator control label hidden in H3: Empathy x judged-status moderation. The panels show predicted judgments on the observed -9 to 9 scale with 95% confidence intervals.</w:t>
+        <w:t xml:space="preserve">Interaction Plot for Negotiator-side structure: judged negotiator ingroup, counterpart negotiator outgroup (ref = judged negotiator ingroup, counterpart negotiator ingroup) x Player-victim outgroup (ref = ingroup victim) in H2: Negotiator-side relational structure. The panels show predicted judgments on the observed -9 to 9 scale with 95% confidence intervals.</w:t>
       </w:r>
     </w:p>
     <w:p>
@@ -803,7 +803,7 @@
         <w:pStyle w:val="BodyText"/>
       </w:pPr>
       <w:r>
-        <w:t xml:space="preserve">Personal distress x judged negotiator outgroup is statistically significant in the Tobit model (*, p = 0.016). The figure below shows that the predicted relationship rises most sharply for Empathy: Personal distress when the condition is Judged negotiator outgroup.</w:t>
+        <w:t xml:space="preserve">Negotiator-side structure: judged negotiator outgroup, counterpart negotiator ingroup (ref = judged negotiator ingroup, counterpart negotiator ingroup) is statistically significant in the Tobit model (+, p = 0.057). The figure below shows that predicted judgment is lower for judged negotiator outgroup, counterpart negotiator ingroup (ref = judged negotiator ingroup, counterpart negotiator ingroup) than for Reference structure: judged ingroup, counterpart ingroup.</w:t>
       </w:r>
     </w:p>
     <w:p>
@@ -815,12 +815,12 @@
           <wp:inline>
             <wp:extent cx="5334000" cy="4000500"/>
             <wp:effectExtent b="0" l="0" r="0" t="0"/>
-            <wp:docPr descr="Interaction Plot for Personal distress x judged negotiator outgroup in H3: Empathy x judged-status moderation. The panels show predicted judgments on the observed -9 to 9 scale with 95% confidence intervals." title="" id="31" name="Picture"/>
+            <wp:docPr descr="Grouped Prediction Plot for Negotiator-side structure: judged negotiator outgroup, counterpart negotiator ingroup (ref = judged negotiator ingroup, counterpart negotiator ingroup) in H2: Negotiator-side relational structure. The panels show predicted judgments on the observed -9 to 9 scale with 95% confidence intervals." title="" id="31" name="Picture"/>
             <a:graphic>
               <a:graphicData uri="http://schemas.openxmlformats.org/drawingml/2006/picture">
                 <pic:pic>
                   <pic:nvPicPr>
-                    <pic:cNvPr descr="../figures/figure_sig_H3_iri_pd_judged_outgroup_h3_personal_distress_x_judged_negotiator_outgroup.png" id="32" name="Picture"/>
+                    <pic:cNvPr descr="../figures/figure_sig_H2_h2_negstruct_j_out_c_in_h2_negotiator_side_structure_judged_negotiator_outgroup_counterpart_negotiator_ingroup_ref.png" id="32" name="Picture"/>
                     <pic:cNvPicPr>
                       <a:picLocks noChangeArrowheads="1" noChangeAspect="1"/>
                     </pic:cNvPicPr>
@@ -858,15 +858,25 @@
         <w:pStyle w:val="ImageCaption"/>
       </w:pPr>
       <w:r>
-        <w:t xml:space="preserve">Interaction Plot for Personal distress x judged negotiator outgroup in H3: Empathy x judged-status moderation. The panels show predicted judgments on the observed -9 to 9 scale with 95% confidence intervals.</w:t>
-      </w:r>
-    </w:p>
-    <w:p>
-      <w:pPr>
-        <w:pStyle w:val="BodyText"/>
-      </w:pPr>
-      <w:r>
-        <w:t xml:space="preserve">Empathic concern x judged negotiator outgroup is statistically significant in the Tobit model (*, p = 0.026). The figure below shows that the predicted relationship falls most sharply for Empathy: Empathic concern when the condition is Judged negotiator outgroup.</w:t>
+        <w:t xml:space="preserve">Grouped Prediction Plot for Negotiator-side structure: judged negotiator outgroup, counterpart negotiator ingroup (ref = judged negotiator ingroup, counterpart negotiator ingroup) in H2: Negotiator-side relational structure. The panels show predicted judgments on the observed -9 to 9 scale with 95% confidence intervals.</w:t>
+      </w:r>
+    </w:p>
+    <w:bookmarkEnd w:id="33"/>
+    <w:bookmarkStart w:id="46" w:name="h3-empathy-x-judged-status-moderation"/>
+    <w:p>
+      <w:pPr>
+        <w:pStyle w:val="Heading3"/>
+      </w:pPr>
+      <w:r>
+        <w:t xml:space="preserve">H3: Empathy x judged-status moderation</w:t>
+      </w:r>
+    </w:p>
+    <w:p>
+      <w:pPr>
+        <w:pStyle w:val="FirstParagraph"/>
+      </w:pPr>
+      <w:r>
+        <w:t xml:space="preserve">Empathy x judged negotiator control label hidden is statistically significant in the Tobit model (**, p = 0.007). The figure below shows that the predicted relationship rises most sharply for Empathy composite (average) when the condition is Judged negotiator control label hidden.</w:t>
       </w:r>
     </w:p>
     <w:p>
@@ -878,18 +888,18 @@
           <wp:inline>
             <wp:extent cx="5334000" cy="4000500"/>
             <wp:effectExtent b="0" l="0" r="0" t="0"/>
-            <wp:docPr descr="Interaction Plot for Empathic concern x judged negotiator outgroup in H3: Empathy x judged-status moderation. The panels show predicted judgments on the observed -9 to 9 scale with 95% confidence intervals." title="" id="34" name="Picture"/>
+            <wp:docPr descr="Interaction Plot for Empathy x judged negotiator control label hidden in H3: Empathy x judged-status moderation. The panels show predicted judgments on the observed -9 to 9 scale with 95% confidence intervals." title="" id="35" name="Picture"/>
             <a:graphic>
               <a:graphicData uri="http://schemas.openxmlformats.org/drawingml/2006/picture">
                 <pic:pic>
                   <pic:nvPicPr>
-                    <pic:cNvPr descr="../figures/figure_sig_H3_iri_ec_judged_outgroup_h3_empathic_concern_x_judged_negotiator_outgroup.png" id="35" name="Picture"/>
+                    <pic:cNvPr descr="../figures/figure_sig_H3_iri_total_judged_control_h3_empathy_x_judged_negotiator_control_label_hidden.png" id="36" name="Picture"/>
                     <pic:cNvPicPr>
                       <a:picLocks noChangeArrowheads="1" noChangeAspect="1"/>
                     </pic:cNvPicPr>
                   </pic:nvPicPr>
                   <pic:blipFill>
-                    <a:blip r:embed="rId33"/>
+                    <a:blip r:embed="rId34"/>
                     <a:stretch>
                       <a:fillRect/>
                     </a:stretch>
@@ -921,7 +931,7 @@
         <w:pStyle w:val="ImageCaption"/>
       </w:pPr>
       <w:r>
-        <w:t xml:space="preserve">Interaction Plot for Empathic concern x judged negotiator outgroup in H3: Empathy x judged-status moderation. The panels show predicted judgments on the observed -9 to 9 scale with 95% confidence intervals.</w:t>
+        <w:t xml:space="preserve">Interaction Plot for Empathy x judged negotiator control label hidden in H3: Empathy x judged-status moderation. The panels show predicted judgments on the observed -9 to 9 scale with 95% confidence intervals.</w:t>
       </w:r>
     </w:p>
     <w:p>
@@ -929,7 +939,7 @@
         <w:pStyle w:val="BodyText"/>
       </w:pPr>
       <w:r>
-        <w:t xml:space="preserve">Empathy x judged negotiator outgroup is statistically significant in the Tobit model (*, p = 0.050). The figure below shows that the predicted relationship rises most sharply for Empathy composite (average) when the condition is Judged negotiator ingroup.</w:t>
+        <w:t xml:space="preserve">Personal distress x judged negotiator outgroup is statistically significant in the Tobit model (*, p = 0.016). The figure below shows that the predicted relationship rises most sharply for Empathy: Personal distress when the condition is Judged negotiator outgroup.</w:t>
       </w:r>
     </w:p>
     <w:p>
@@ -941,18 +951,18 @@
           <wp:inline>
             <wp:extent cx="5334000" cy="4000500"/>
             <wp:effectExtent b="0" l="0" r="0" t="0"/>
-            <wp:docPr descr="Interaction Plot for Empathy x judged negotiator outgroup in H3: Empathy x judged-status moderation. The panels show predicted judgments on the observed -9 to 9 scale with 95% confidence intervals." title="" id="37" name="Picture"/>
+            <wp:docPr descr="Interaction Plot for Personal distress x judged negotiator outgroup in H3: Empathy x judged-status moderation. The panels show predicted judgments on the observed -9 to 9 scale with 95% confidence intervals." title="" id="38" name="Picture"/>
             <a:graphic>
               <a:graphicData uri="http://schemas.openxmlformats.org/drawingml/2006/picture">
                 <pic:pic>
                   <pic:nvPicPr>
-                    <pic:cNvPr descr="../figures/figure_sig_H3_iri_total_judged_outgroup_h3_empathy_x_judged_negotiator_outgroup.png" id="38" name="Picture"/>
+                    <pic:cNvPr descr="../figures/figure_sig_H3_iri_pd_judged_outgroup_h3_personal_distress_x_judged_negotiator_outgroup.png" id="39" name="Picture"/>
                     <pic:cNvPicPr>
                       <a:picLocks noChangeArrowheads="1" noChangeAspect="1"/>
                     </pic:cNvPicPr>
                   </pic:nvPicPr>
                   <pic:blipFill>
-                    <a:blip r:embed="rId36"/>
+                    <a:blip r:embed="rId37"/>
                     <a:stretch>
                       <a:fillRect/>
                     </a:stretch>
@@ -984,100 +994,15 @@
         <w:pStyle w:val="ImageCaption"/>
       </w:pPr>
       <w:r>
-        <w:t xml:space="preserve">Interaction Plot for Empathy x judged negotiator outgroup in H3: Empathy x judged-status moderation. The panels show predicted judgments on the observed -9 to 9 scale with 95% confidence intervals.</w:t>
-      </w:r>
-    </w:p>
-    <w:bookmarkEnd w:id="39"/>
-    <w:bookmarkEnd w:id="40"/>
-    <w:bookmarkStart w:id="112" w:name="all-significant-predictors-p-.10"/>
-    <w:p>
-      <w:pPr>
-        <w:pStyle w:val="Heading2"/>
-      </w:pPr>
-      <w:r>
-        <w:t xml:space="preserve">All Significant Predictors (p &lt; .10)</w:t>
-      </w:r>
-    </w:p>
-    <w:p>
-      <w:pPr>
-        <w:pStyle w:val="FirstParagraph"/>
-      </w:pPr>
-      <w:r>
-        <w:t xml:space="preserve">The following figures extend beyond the hypothesis-target terms and visualize every predictor that reaches</w:t>
-      </w:r>
-      <w:r>
-        <w:t xml:space="preserve"> </w:t>
-      </w:r>
-      <w:r>
-        <w:rPr>
-          <w:rStyle w:val="VerbatimChar"/>
-        </w:rPr>
-        <w:t xml:space="preserve">p &lt; .10</w:t>
-      </w:r>
-      <w:r>
-        <w:t xml:space="preserve"> </w:t>
-      </w:r>
-      <w:r>
-        <w:t xml:space="preserve">in the available H1-H3 Tobit models. This includes significant controls such as age when they clear the threshold.</w:t>
-      </w:r>
-    </w:p>
-    <w:bookmarkStart w:id="71" w:name="judgments_bystander"/>
-    <w:p>
-      <w:pPr>
-        <w:pStyle w:val="Heading3"/>
-      </w:pPr>
-      <w:r>
-        <w:t xml:space="preserve">judgments_bystander</w:t>
-      </w:r>
-    </w:p>
-    <w:p>
-      <w:pPr>
-        <w:pStyle w:val="FirstParagraph"/>
-      </w:pPr>
-      <w:r>
-        <w:t xml:space="preserve">Negotiator accepted harmful deal is statistically significant in:</w:t>
-      </w:r>
-      <w:r>
-        <w:t xml:space="preserve"> </w:t>
-      </w:r>
-      <w:r>
-        <w:t xml:space="preserve">- H1: Empathy under relational controls Model A (Tobit)</w:t>
-      </w:r>
-      <w:r>
-        <w:t xml:space="preserve"> </w:t>
-      </w:r>
-      <w:r>
-        <w:t xml:space="preserve">- H1: Empathy under relational controls Model B (Tobit)</w:t>
-      </w:r>
-      <w:r>
-        <w:t xml:space="preserve"> </w:t>
-      </w:r>
-      <w:r>
-        <w:t xml:space="preserve">- H2: Judged-status x decision contrasts Model A (Tobit)</w:t>
-      </w:r>
-      <w:r>
-        <w:t xml:space="preserve"> </w:t>
-      </w:r>
-      <w:r>
-        <w:t xml:space="preserve">- H2: Judged-status x decision contrasts Model B (Tobit)</w:t>
-      </w:r>
-      <w:r>
-        <w:t xml:space="preserve"> </w:t>
-      </w:r>
-      <w:r>
-        <w:t xml:space="preserve">- H3: Empathy x judged-status moderation Model B (Tobit)</w:t>
-      </w:r>
-      <w:r>
-        <w:t xml:space="preserve"> </w:t>
-      </w:r>
-      <w:r>
-        <w:t xml:space="preserve">- H3: Empathy x judged-status moderation Model A (Tobit)</w:t>
-      </w:r>
-      <w:r>
-        <w:t xml:space="preserve"> </w:t>
-      </w:r>
-      <w:r>
-        <w:t xml:space="preserve">The figure below shows that predicted judgment is lower for Accept harmful deal than for Reject harmful deal.</w:t>
+        <w:t xml:space="preserve">Interaction Plot for Personal distress x judged negotiator outgroup in H3: Empathy x judged-status moderation. The panels show predicted judgments on the observed -9 to 9 scale with 95% confidence intervals.</w:t>
+      </w:r>
+    </w:p>
+    <w:p>
+      <w:pPr>
+        <w:pStyle w:val="BodyText"/>
+      </w:pPr>
+      <w:r>
+        <w:t xml:space="preserve">Empathic concern x judged negotiator outgroup is statistically significant in the Tobit model (*, p = 0.026). The figure below shows that the predicted relationship falls most sharply for Empathy: Empathic concern when the condition is Judged negotiator outgroup.</w:t>
       </w:r>
     </w:p>
     <w:p>
@@ -1089,18 +1014,18 @@
           <wp:inline>
             <wp:extent cx="5334000" cy="4000500"/>
             <wp:effectExtent b="0" l="0" r="0" t="0"/>
-            <wp:docPr descr="Grouped Prediction Plot for Negotiator accepted harmful deal in the judgments_bystander. The panels show predicted judgments on the observed -9 to 9 scale with 95% confidence intervals." title="" id="42" name="Picture"/>
+            <wp:docPr descr="Interaction Plot for Empathic concern x judged negotiator outgroup in H3: Empathy x judged-status moderation. The panels show predicted judgments on the observed -9 to 9 scale with 95% confidence intervals." title="" id="41" name="Picture"/>
             <a:graphic>
               <a:graphicData uri="http://schemas.openxmlformats.org/drawingml/2006/picture">
                 <pic:pic>
                   <pic:nvPicPr>
-                    <pic:cNvPr descr="../figures/figure_sig_all_judgments_bystander_decision_accept_judgments_bystander_negotiator_accepted_harmful_deal.png" id="43" name="Picture"/>
+                    <pic:cNvPr descr="../figures/figure_sig_H3_iri_ec_judged_outgroup_h3_empathic_concern_x_judged_negotiator_outgroup.png" id="42" name="Picture"/>
                     <pic:cNvPicPr>
                       <a:picLocks noChangeArrowheads="1" noChangeAspect="1"/>
                     </pic:cNvPicPr>
                   </pic:nvPicPr>
                   <pic:blipFill>
-                    <a:blip r:embed="rId41"/>
+                    <a:blip r:embed="rId40"/>
                     <a:stretch>
                       <a:fillRect/>
                     </a:stretch>
@@ -1132,7 +1057,7 @@
         <w:pStyle w:val="ImageCaption"/>
       </w:pPr>
       <w:r>
-        <w:t xml:space="preserve">Grouped Prediction Plot for Negotiator accepted harmful deal in the judgments_bystander. The panels show predicted judgments on the observed -9 to 9 scale with 95% confidence intervals.</w:t>
+        <w:t xml:space="preserve">Interaction Plot for Empathic concern x judged negotiator outgroup in H3: Empathy x judged-status moderation. The panels show predicted judgments on the observed -9 to 9 scale with 95% confidence intervals.</w:t>
       </w:r>
     </w:p>
     <w:p>
@@ -1140,19 +1065,7 @@
         <w:pStyle w:val="BodyText"/>
       </w:pPr>
       <w:r>
-        <w:t xml:space="preserve">Empathy x judged negotiator control label hidden is statistically significant in:</w:t>
-      </w:r>
-      <w:r>
-        <w:t xml:space="preserve"> </w:t>
-      </w:r>
-      <w:r>
-        <w:t xml:space="preserve">- H3: Empathy x judged-status moderation Model A (Tobit)</w:t>
-      </w:r>
-      <w:r>
-        <w:t xml:space="preserve"> </w:t>
-      </w:r>
-      <w:r>
-        <w:t xml:space="preserve">The figure below shows that the predicted relationship rises most sharply for Empathy composite (average) when the condition is Judged negotiator control label hidden.</w:t>
+        <w:t xml:space="preserve">Empathy x judged negotiator outgroup is statistically significant in the Tobit model (*, p = 0.050). The figure below shows that the predicted relationship rises most sharply for Empathy composite (average) when the condition is Judged negotiator ingroup.</w:t>
       </w:r>
     </w:p>
     <w:p>
@@ -1164,18 +1077,18 @@
           <wp:inline>
             <wp:extent cx="5334000" cy="4000500"/>
             <wp:effectExtent b="0" l="0" r="0" t="0"/>
-            <wp:docPr descr="Interaction Plot for Empathy x judged negotiator control label hidden in the judgments_bystander. The panels show predicted judgments on the observed -9 to 9 scale with 95% confidence intervals." title="" id="45" name="Picture"/>
+            <wp:docPr descr="Interaction Plot for Empathy x judged negotiator outgroup in H3: Empathy x judged-status moderation. The panels show predicted judgments on the observed -9 to 9 scale with 95% confidence intervals." title="" id="44" name="Picture"/>
             <a:graphic>
               <a:graphicData uri="http://schemas.openxmlformats.org/drawingml/2006/picture">
                 <pic:pic>
                   <pic:nvPicPr>
-                    <pic:cNvPr descr="../figures/figure_sig_all_judgments_bystander_iri_total_judged_control_judgments_bystander_empathy_x_judged_negotiator_control_label_hidden.png" id="46" name="Picture"/>
+                    <pic:cNvPr descr="../figures/figure_sig_H3_iri_total_judged_outgroup_h3_empathy_x_judged_negotiator_outgroup.png" id="45" name="Picture"/>
                     <pic:cNvPicPr>
                       <a:picLocks noChangeArrowheads="1" noChangeAspect="1"/>
                     </pic:cNvPicPr>
                   </pic:nvPicPr>
                   <pic:blipFill>
-                    <a:blip r:embed="rId44"/>
+                    <a:blip r:embed="rId43"/>
                     <a:stretch>
                       <a:fillRect/>
                     </a:stretch>
@@ -1207,27 +1120,58 @@
         <w:pStyle w:val="ImageCaption"/>
       </w:pPr>
       <w:r>
-        <w:t xml:space="preserve">Interaction Plot for Empathy x judged negotiator control label hidden in the judgments_bystander. The panels show predicted judgments on the observed -9 to 9 scale with 95% confidence intervals.</w:t>
-      </w:r>
-    </w:p>
-    <w:p>
-      <w:pPr>
-        <w:pStyle w:val="BodyText"/>
-      </w:pPr>
-      <w:r>
-        <w:t xml:space="preserve">Socioeconomic status is statistically significant in:</w:t>
-      </w:r>
-      <w:r>
-        <w:t xml:space="preserve"> </w:t>
-      </w:r>
-      <w:r>
-        <w:t xml:space="preserve">- H2: Judged-status x decision contrasts Model A (Tobit)</w:t>
-      </w:r>
-      <w:r>
-        <w:t xml:space="preserve"> </w:t>
-      </w:r>
-      <w:r>
-        <w:t xml:space="preserve">- H2: Judged-status x decision contrasts Model B (Tobit)</w:t>
+        <w:t xml:space="preserve">Interaction Plot for Empathy x judged negotiator outgroup in H3: Empathy x judged-status moderation. The panels show predicted judgments on the observed -9 to 9 scale with 95% confidence intervals.</w:t>
+      </w:r>
+    </w:p>
+    <w:bookmarkEnd w:id="46"/>
+    <w:bookmarkEnd w:id="47"/>
+    <w:bookmarkStart w:id="140" w:name="all-significant-predictors-p-.10"/>
+    <w:p>
+      <w:pPr>
+        <w:pStyle w:val="Heading2"/>
+      </w:pPr>
+      <w:r>
+        <w:t xml:space="preserve">All Significant Predictors (p &lt; .10)</w:t>
+      </w:r>
+    </w:p>
+    <w:p>
+      <w:pPr>
+        <w:pStyle w:val="FirstParagraph"/>
+      </w:pPr>
+      <w:r>
+        <w:t xml:space="preserve">The following figures extend beyond the hypothesis-target terms and visualize every predictor that reaches</w:t>
+      </w:r>
+      <w:r>
+        <w:t xml:space="preserve"> </w:t>
+      </w:r>
+      <w:r>
+        <w:rPr>
+          <w:rStyle w:val="VerbatimChar"/>
+        </w:rPr>
+        <w:t xml:space="preserve">p &lt; .10</w:t>
+      </w:r>
+      <w:r>
+        <w:t xml:space="preserve"> </w:t>
+      </w:r>
+      <w:r>
+        <w:t xml:space="preserve">in the available H1-H3 Tobit models. This includes significant controls such as age when they clear the threshold.</w:t>
+      </w:r>
+    </w:p>
+    <w:bookmarkStart w:id="96" w:name="judgments_bystander"/>
+    <w:p>
+      <w:pPr>
+        <w:pStyle w:val="Heading3"/>
+      </w:pPr>
+      <w:r>
+        <w:t xml:space="preserve">judgments_bystander</w:t>
+      </w:r>
+    </w:p>
+    <w:p>
+      <w:pPr>
+        <w:pStyle w:val="FirstParagraph"/>
+      </w:pPr>
+      <w:r>
+        <w:t xml:space="preserve">Negotiator accepted harmful deal is statistically significant in:</w:t>
       </w:r>
       <w:r>
         <w:t xml:space="preserve"> </w:t>
@@ -1239,19 +1183,25 @@
         <w:t xml:space="preserve"> </w:t>
       </w:r>
       <w:r>
+        <w:t xml:space="preserve">- H1: Empathy under relational controls Model B (Tobit)</w:t>
+      </w:r>
+      <w:r>
+        <w:t xml:space="preserve"> </w:t>
+      </w:r>
+      <w:r>
+        <w:t xml:space="preserve">- H3: Empathy x judged-status moderation Model B (Tobit)</w:t>
+      </w:r>
+      <w:r>
+        <w:t xml:space="preserve"> </w:t>
+      </w:r>
+      <w:r>
         <w:t xml:space="preserve">- H3: Empathy x judged-status moderation Model A (Tobit)</w:t>
       </w:r>
       <w:r>
         <w:t xml:space="preserve"> </w:t>
       </w:r>
       <w:r>
-        <w:t xml:space="preserve">- H1: Empathy under relational controls Model B (Tobit)</w:t>
-      </w:r>
-      <w:r>
-        <w:t xml:space="preserve"> </w:t>
-      </w:r>
-      <w:r>
-        <w:t xml:space="preserve">The figure below shows that predicted judgment is higher for Socioeconomic status 5 than for Socioeconomic status 0.</w:t>
+        <w:t xml:space="preserve">The figure below shows that predicted judgment is lower for Accept harmful deal than for Reject harmful deal.</w:t>
       </w:r>
     </w:p>
     <w:p>
@@ -1263,18 +1213,18 @@
           <wp:inline>
             <wp:extent cx="5334000" cy="4000500"/>
             <wp:effectExtent b="0" l="0" r="0" t="0"/>
-            <wp:docPr descr="Grouped Prediction Plot for Socioeconomic status in the judgments_bystander. The panels show predicted judgments on the observed -9 to 9 scale with 95% confidence intervals." title="" id="48" name="Picture"/>
+            <wp:docPr descr="Grouped Prediction Plot for Negotiator accepted harmful deal in the judgments_bystander. The panels show predicted judgments on the observed -9 to 9 scale with 95% confidence intervals." title="" id="49" name="Picture"/>
             <a:graphic>
               <a:graphicData uri="http://schemas.openxmlformats.org/drawingml/2006/picture">
                 <pic:pic>
                   <pic:nvPicPr>
-                    <pic:cNvPr descr="../figures/figure_sig_all_judgments_bystander_economic_status_judgments_bystander_socioeconomic_status.png" id="49" name="Picture"/>
+                    <pic:cNvPr descr="../figures/figure_sig_all_judgments_bystander_decision_accept_judgments_bystander_negotiator_accepted_harmful_deal.png" id="50" name="Picture"/>
                     <pic:cNvPicPr>
                       <a:picLocks noChangeArrowheads="1" noChangeAspect="1"/>
                     </pic:cNvPicPr>
                   </pic:nvPicPr>
                   <pic:blipFill>
-                    <a:blip r:embed="rId47"/>
+                    <a:blip r:embed="rId48"/>
                     <a:stretch>
                       <a:fillRect/>
                     </a:stretch>
@@ -1306,7 +1256,7 @@
         <w:pStyle w:val="ImageCaption"/>
       </w:pPr>
       <w:r>
-        <w:t xml:space="preserve">Grouped Prediction Plot for Socioeconomic status in the judgments_bystander. The panels show predicted judgments on the observed -9 to 9 scale with 95% confidence intervals.</w:t>
+        <w:t xml:space="preserve">Grouped Prediction Plot for Negotiator accepted harmful deal in the judgments_bystander. The panels show predicted judgments on the observed -9 to 9 scale with 95% confidence intervals.</w:t>
       </w:r>
     </w:p>
     <w:p>
@@ -1314,7 +1264,7 @@
         <w:pStyle w:val="BodyText"/>
       </w:pPr>
       <w:r>
-        <w:t xml:space="preserve">Judged negotiator control label hidden (ref = ingroup) is statistically significant in:</w:t>
+        <w:t xml:space="preserve">Empathy x judged negotiator control label hidden is statistically significant in:</w:t>
       </w:r>
       <w:r>
         <w:t xml:space="preserve"> </w:t>
@@ -1326,13 +1276,7 @@
         <w:t xml:space="preserve"> </w:t>
       </w:r>
       <w:r>
-        <w:t xml:space="preserve">- H3: Empathy x judged-status moderation Model B (Tobit)</w:t>
-      </w:r>
-      <w:r>
-        <w:t xml:space="preserve"> </w:t>
-      </w:r>
-      <w:r>
-        <w:t xml:space="preserve">The figure below shows that predicted judgment is higher for Judged negotiator control label hidden than for Judged negotiator ingroup.</w:t>
+        <w:t xml:space="preserve">The figure below shows that the predicted relationship rises most sharply for Empathy composite (average) when the condition is Judged negotiator control label hidden.</w:t>
       </w:r>
     </w:p>
     <w:p>
@@ -1344,18 +1288,18 @@
           <wp:inline>
             <wp:extent cx="5334000" cy="4000500"/>
             <wp:effectExtent b="0" l="0" r="0" t="0"/>
-            <wp:docPr descr="Grouped Prediction Plot for Judged negotiator control label hidden (ref = ingroup) in the judgments_bystander. The panels show predicted judgments on the observed -9 to 9 scale with 95% confidence intervals." title="" id="51" name="Picture"/>
+            <wp:docPr descr="Interaction Plot for Empathy x judged negotiator control label hidden in the judgments_bystander. The panels show predicted judgments on the observed -9 to 9 scale with 95% confidence intervals." title="" id="52" name="Picture"/>
             <a:graphic>
               <a:graphicData uri="http://schemas.openxmlformats.org/drawingml/2006/picture">
                 <pic:pic>
                   <pic:nvPicPr>
-                    <pic:cNvPr descr="../figures/figure_sig_all_judgments_bystander_judged_control_judgments_bystander_judged_negotiator_control_label_hidden_ref_ingroup.png" id="52" name="Picture"/>
+                    <pic:cNvPr descr="../figures/figure_sig_all_judgments_bystander_iri_total_judged_control_judgments_bystander_empathy_x_judged_negotiator_control_label_hidden.png" id="53" name="Picture"/>
                     <pic:cNvPicPr>
                       <a:picLocks noChangeArrowheads="1" noChangeAspect="1"/>
                     </pic:cNvPicPr>
                   </pic:nvPicPr>
                   <pic:blipFill>
-                    <a:blip r:embed="rId50"/>
+                    <a:blip r:embed="rId51"/>
                     <a:stretch>
                       <a:fillRect/>
                     </a:stretch>
@@ -1387,7 +1331,7 @@
         <w:pStyle w:val="ImageCaption"/>
       </w:pPr>
       <w:r>
-        <w:t xml:space="preserve">Grouped Prediction Plot for Judged negotiator control label hidden (ref = ingroup) in the judgments_bystander. The panels show predicted judgments on the observed -9 to 9 scale with 95% confidence intervals.</w:t>
+        <w:t xml:space="preserve">Interaction Plot for Empathy x judged negotiator control label hidden in the judgments_bystander. The panels show predicted judgments on the observed -9 to 9 scale with 95% confidence intervals.</w:t>
       </w:r>
     </w:p>
     <w:p>
@@ -1395,19 +1339,43 @@
         <w:pStyle w:val="BodyText"/>
       </w:pPr>
       <w:r>
-        <w:t xml:space="preserve">Personal distress x judged negotiator outgroup is statistically significant in:</w:t>
-      </w:r>
-      <w:r>
-        <w:t xml:space="preserve"> </w:t>
-      </w:r>
-      <w:r>
-        <w:t xml:space="preserve">- H3: Empathy x judged-status moderation Model B (Tobit)</w:t>
-      </w:r>
-      <w:r>
-        <w:t xml:space="preserve"> </w:t>
-      </w:r>
-      <w:r>
-        <w:t xml:space="preserve">The figure below shows that the predicted relationship rises most sharply for Empathy: Personal distress when the condition is Judged negotiator outgroup.</w:t>
+        <w:t xml:space="preserve">Socioeconomic status is statistically significant in:</w:t>
+      </w:r>
+      <w:r>
+        <w:t xml:space="preserve"> </w:t>
+      </w:r>
+      <w:r>
+        <w:t xml:space="preserve">- H2: Negotiator-side relational structure Model A (Tobit)</w:t>
+      </w:r>
+      <w:r>
+        <w:t xml:space="preserve"> </w:t>
+      </w:r>
+      <w:r>
+        <w:t xml:space="preserve">- H2: Negotiator-side relational structure Model B (Tobit)</w:t>
+      </w:r>
+      <w:r>
+        <w:t xml:space="preserve"> </w:t>
+      </w:r>
+      <w:r>
+        <w:t xml:space="preserve">- H1: Empathy under relational controls Model A (Tobit)</w:t>
+      </w:r>
+      <w:r>
+        <w:t xml:space="preserve"> </w:t>
+      </w:r>
+      <w:r>
+        <w:t xml:space="preserve">- H3: Empathy x judged-status moderation Model A (Tobit)</w:t>
+      </w:r>
+      <w:r>
+        <w:t xml:space="preserve"> </w:t>
+      </w:r>
+      <w:r>
+        <w:t xml:space="preserve">- H1: Empathy under relational controls Model B (Tobit)</w:t>
+      </w:r>
+      <w:r>
+        <w:t xml:space="preserve"> </w:t>
+      </w:r>
+      <w:r>
+        <w:t xml:space="preserve">The figure below shows that predicted judgment is higher for Socioeconomic status 5 than for Socioeconomic status 0.</w:t>
       </w:r>
     </w:p>
     <w:p>
@@ -1419,18 +1387,18 @@
           <wp:inline>
             <wp:extent cx="5334000" cy="4000500"/>
             <wp:effectExtent b="0" l="0" r="0" t="0"/>
-            <wp:docPr descr="Interaction Plot for Personal distress x judged negotiator outgroup in the judgments_bystander. The panels show predicted judgments on the observed -9 to 9 scale with 95% confidence intervals." title="" id="54" name="Picture"/>
+            <wp:docPr descr="Grouped Prediction Plot for Socioeconomic status in the judgments_bystander. The panels show predicted judgments on the observed -9 to 9 scale with 95% confidence intervals." title="" id="55" name="Picture"/>
             <a:graphic>
               <a:graphicData uri="http://schemas.openxmlformats.org/drawingml/2006/picture">
                 <pic:pic>
                   <pic:nvPicPr>
-                    <pic:cNvPr descr="../figures/figure_sig_all_judgments_bystander_iri_pd_judged_outgroup_judgments_bystander_personal_distress_x_judged_negotiator_outgroup.png" id="55" name="Picture"/>
+                    <pic:cNvPr descr="../figures/figure_sig_all_judgments_bystander_economic_status_judgments_bystander_socioeconomic_status.png" id="56" name="Picture"/>
                     <pic:cNvPicPr>
                       <a:picLocks noChangeArrowheads="1" noChangeAspect="1"/>
                     </pic:cNvPicPr>
                   </pic:nvPicPr>
                   <pic:blipFill>
-                    <a:blip r:embed="rId53"/>
+                    <a:blip r:embed="rId54"/>
                     <a:stretch>
                       <a:fillRect/>
                     </a:stretch>
@@ -1462,7 +1430,7 @@
         <w:pStyle w:val="ImageCaption"/>
       </w:pPr>
       <w:r>
-        <w:t xml:space="preserve">Interaction Plot for Personal distress x judged negotiator outgroup in the judgments_bystander. The panels show predicted judgments on the observed -9 to 9 scale with 95% confidence intervals.</w:t>
+        <w:t xml:space="preserve">Grouped Prediction Plot for Socioeconomic status in the judgments_bystander. The panels show predicted judgments on the observed -9 to 9 scale with 95% confidence intervals.</w:t>
       </w:r>
     </w:p>
     <w:p>
@@ -1470,19 +1438,7 @@
         <w:pStyle w:val="BodyText"/>
       </w:pPr>
       <w:r>
-        <w:t xml:space="preserve">Engineering participant (ref = humanities) is statistically significant in:</w:t>
-      </w:r>
-      <w:r>
-        <w:t xml:space="preserve"> </w:t>
-      </w:r>
-      <w:r>
-        <w:t xml:space="preserve">- H2: Judged-status x decision contrasts Model A (Tobit)</w:t>
-      </w:r>
-      <w:r>
-        <w:t xml:space="preserve"> </w:t>
-      </w:r>
-      <w:r>
-        <w:t xml:space="preserve">- H1: Empathy under relational controls Model A (Tobit)</w:t>
+        <w:t xml:space="preserve">Judged negotiator control label hidden (ref = ingroup) is statistically significant in:</w:t>
       </w:r>
       <w:r>
         <w:t xml:space="preserve"> </w:t>
@@ -1494,25 +1450,13 @@
         <w:t xml:space="preserve"> </w:t>
       </w:r>
       <w:r>
-        <w:t xml:space="preserve">- H2: Judged-status x decision contrasts Model B (Tobit)</w:t>
-      </w:r>
-      <w:r>
-        <w:t xml:space="preserve"> </w:t>
-      </w:r>
-      <w:r>
-        <w:t xml:space="preserve">- H1: Empathy under relational controls Model B (Tobit)</w:t>
-      </w:r>
-      <w:r>
-        <w:t xml:space="preserve"> </w:t>
-      </w:r>
-      <w:r>
         <w:t xml:space="preserve">- H3: Empathy x judged-status moderation Model B (Tobit)</w:t>
       </w:r>
       <w:r>
         <w:t xml:space="preserve"> </w:t>
       </w:r>
       <w:r>
-        <w:t xml:space="preserve">The figure below shows that predicted judgment is higher for Engineering participant than for Humanities participant.</w:t>
+        <w:t xml:space="preserve">The figure below shows that predicted judgment is higher for Judged negotiator control label hidden than for Judged negotiator ingroup.</w:t>
       </w:r>
     </w:p>
     <w:p>
@@ -1524,18 +1468,18 @@
           <wp:inline>
             <wp:extent cx="5334000" cy="4000500"/>
             <wp:effectExtent b="0" l="0" r="0" t="0"/>
-            <wp:docPr descr="Grouped Prediction Plot for Engineering participant (ref = humanities) in the judgments_bystander. The panels show predicted judgments on the observed -9 to 9 scale with 95% confidence intervals." title="" id="57" name="Picture"/>
+            <wp:docPr descr="Grouped Prediction Plot for Judged negotiator control label hidden (ref = ingroup) in the judgments_bystander. The panels show predicted judgments on the observed -9 to 9 scale with 95% confidence intervals." title="" id="58" name="Picture"/>
             <a:graphic>
               <a:graphicData uri="http://schemas.openxmlformats.org/drawingml/2006/picture">
                 <pic:pic>
                   <pic:nvPicPr>
-                    <pic:cNvPr descr="../figures/figure_sig_all_judgments_bystander_participant_engineering_judgments_bystander_engineering_participant_ref_humanities.png" id="58" name="Picture"/>
+                    <pic:cNvPr descr="../figures/figure_sig_all_judgments_bystander_judged_control_judgments_bystander_judged_negotiator_control_label_hidden_ref_ingroup.png" id="59" name="Picture"/>
                     <pic:cNvPicPr>
                       <a:picLocks noChangeArrowheads="1" noChangeAspect="1"/>
                     </pic:cNvPicPr>
                   </pic:nvPicPr>
                   <pic:blipFill>
-                    <a:blip r:embed="rId56"/>
+                    <a:blip r:embed="rId57"/>
                     <a:stretch>
                       <a:fillRect/>
                     </a:stretch>
@@ -1567,7 +1511,7 @@
         <w:pStyle w:val="ImageCaption"/>
       </w:pPr>
       <w:r>
-        <w:t xml:space="preserve">Grouped Prediction Plot for Engineering participant (ref = humanities) in the judgments_bystander. The panels show predicted judgments on the observed -9 to 9 scale with 95% confidence intervals.</w:t>
+        <w:t xml:space="preserve">Grouped Prediction Plot for Judged negotiator control label hidden (ref = ingroup) in the judgments_bystander. The panels show predicted judgments on the observed -9 to 9 scale with 95% confidence intervals.</w:t>
       </w:r>
     </w:p>
     <w:p>
@@ -1575,31 +1519,7 @@
         <w:pStyle w:val="BodyText"/>
       </w:pPr>
       <w:r>
-        <w:t xml:space="preserve">Counterpart negotiator control label hidden (ref = ingroup) is statistically significant in:</w:t>
-      </w:r>
-      <w:r>
-        <w:t xml:space="preserve"> </w:t>
-      </w:r>
-      <w:r>
-        <w:t xml:space="preserve">- H1: Empathy under relational controls Model B (Tobit)</w:t>
-      </w:r>
-      <w:r>
-        <w:t xml:space="preserve"> </w:t>
-      </w:r>
-      <w:r>
-        <w:t xml:space="preserve">- H2: Judged-status x decision contrasts Model B (Tobit)</w:t>
-      </w:r>
-      <w:r>
-        <w:t xml:space="preserve"> </w:t>
-      </w:r>
-      <w:r>
-        <w:t xml:space="preserve">- H1: Empathy under relational controls Model A (Tobit)</w:t>
-      </w:r>
-      <w:r>
-        <w:t xml:space="preserve"> </w:t>
-      </w:r>
-      <w:r>
-        <w:t xml:space="preserve">- H2: Judged-status x decision contrasts Model A (Tobit)</w:t>
+        <w:t xml:space="preserve">Personal distress x judged negotiator outgroup is statistically significant in:</w:t>
       </w:r>
       <w:r>
         <w:t xml:space="preserve"> </w:t>
@@ -1611,13 +1531,7 @@
         <w:t xml:space="preserve"> </w:t>
       </w:r>
       <w:r>
-        <w:t xml:space="preserve">- H3: Empathy x judged-status moderation Model A (Tobit)</w:t>
-      </w:r>
-      <w:r>
-        <w:t xml:space="preserve"> </w:t>
-      </w:r>
-      <w:r>
-        <w:t xml:space="preserve">The figure below shows that predicted judgment is higher for Counterpart negotiator control label hidden than for Counterpart negotiator ingroup.</w:t>
+        <w:t xml:space="preserve">The figure below shows that the predicted relationship rises most sharply for Empathy: Personal distress when the condition is Judged negotiator outgroup.</w:t>
       </w:r>
     </w:p>
     <w:p>
@@ -1629,18 +1543,18 @@
           <wp:inline>
             <wp:extent cx="5334000" cy="4000500"/>
             <wp:effectExtent b="0" l="0" r="0" t="0"/>
-            <wp:docPr descr="Grouped Prediction Plot for Counterpart negotiator control label hidden (ref = ingroup) in the judgments_bystander. The panels show predicted judgments on the observed -9 to 9 scale with 95% confidence intervals." title="" id="60" name="Picture"/>
+            <wp:docPr descr="Interaction Plot for Personal distress x judged negotiator outgroup in the judgments_bystander. The panels show predicted judgments on the observed -9 to 9 scale with 95% confidence intervals." title="" id="61" name="Picture"/>
             <a:graphic>
               <a:graphicData uri="http://schemas.openxmlformats.org/drawingml/2006/picture">
                 <pic:pic>
                   <pic:nvPicPr>
-                    <pic:cNvPr descr="../figures/figure_sig_all_judgments_bystander_counterpart_control_judgments_bystander_counterpart_negotiator_control_label_hidden_ref_ingroup.png" id="61" name="Picture"/>
+                    <pic:cNvPr descr="../figures/figure_sig_all_judgments_bystander_iri_pd_judged_outgroup_judgments_bystander_personal_distress_x_judged_negotiator_outgroup.png" id="62" name="Picture"/>
                     <pic:cNvPicPr>
                       <a:picLocks noChangeArrowheads="1" noChangeAspect="1"/>
                     </pic:cNvPicPr>
                   </pic:nvPicPr>
                   <pic:blipFill>
-                    <a:blip r:embed="rId59"/>
+                    <a:blip r:embed="rId60"/>
                     <a:stretch>
                       <a:fillRect/>
                     </a:stretch>
@@ -1672,7 +1586,7 @@
         <w:pStyle w:val="ImageCaption"/>
       </w:pPr>
       <w:r>
-        <w:t xml:space="preserve">Grouped Prediction Plot for Counterpart negotiator control label hidden (ref = ingroup) in the judgments_bystander. The panels show predicted judgments on the observed -9 to 9 scale with 95% confidence intervals.</w:t>
+        <w:t xml:space="preserve">Interaction Plot for Personal distress x judged negotiator outgroup in the judgments_bystander. The panels show predicted judgments on the observed -9 to 9 scale with 95% confidence intervals.</w:t>
       </w:r>
     </w:p>
     <w:p>
@@ -1680,7 +1594,19 @@
         <w:pStyle w:val="BodyText"/>
       </w:pPr>
       <w:r>
-        <w:t xml:space="preserve">Empathy: Perspective taking is statistically significant in:</w:t>
+        <w:t xml:space="preserve">Engineering participant (ref = humanities) is statistically significant in:</w:t>
+      </w:r>
+      <w:r>
+        <w:t xml:space="preserve"> </w:t>
+      </w:r>
+      <w:r>
+        <w:t xml:space="preserve">- H1: Empathy under relational controls Model A (Tobit)</w:t>
+      </w:r>
+      <w:r>
+        <w:t xml:space="preserve"> </w:t>
+      </w:r>
+      <w:r>
+        <w:t xml:space="preserve">- H3: Empathy x judged-status moderation Model A (Tobit)</w:t>
       </w:r>
       <w:r>
         <w:t xml:space="preserve"> </w:t>
@@ -1692,19 +1618,19 @@
         <w:t xml:space="preserve"> </w:t>
       </w:r>
       <w:r>
-        <w:t xml:space="preserve">- H2: Judged-status x decision contrasts Model B (Tobit)</w:t>
-      </w:r>
-      <w:r>
-        <w:t xml:space="preserve"> </w:t>
-      </w:r>
-      <w:r>
         <w:t xml:space="preserve">- H3: Empathy x judged-status moderation Model B (Tobit)</w:t>
       </w:r>
       <w:r>
         <w:t xml:space="preserve"> </w:t>
       </w:r>
       <w:r>
-        <w:t xml:space="preserve">The figure below shows that across the observed range, higher Empathy: Perspective taking corresponds to higher predicted judgment.</w:t>
+        <w:t xml:space="preserve">- H2: Negotiator-side relational structure Model A (Tobit)</w:t>
+      </w:r>
+      <w:r>
+        <w:t xml:space="preserve"> </w:t>
+      </w:r>
+      <w:r>
+        <w:t xml:space="preserve">The figure below shows that predicted judgment is higher for Engineering participant than for Humanities participant.</w:t>
       </w:r>
     </w:p>
     <w:p>
@@ -1716,18 +1642,18 @@
           <wp:inline>
             <wp:extent cx="5334000" cy="4000500"/>
             <wp:effectExtent b="0" l="0" r="0" t="0"/>
-            <wp:docPr descr="Effect Plot for Empathy: Perspective taking in the judgments_bystander. The panels show predicted judgments on the observed -9 to 9 scale with 95% confidence intervals." title="" id="63" name="Picture"/>
+            <wp:docPr descr="Grouped Prediction Plot for Engineering participant (ref = humanities) in the judgments_bystander. The panels show predicted judgments on the observed -9 to 9 scale with 95% confidence intervals." title="" id="64" name="Picture"/>
             <a:graphic>
               <a:graphicData uri="http://schemas.openxmlformats.org/drawingml/2006/picture">
                 <pic:pic>
                   <pic:nvPicPr>
-                    <pic:cNvPr descr="../figures/figure_sig_all_judgments_bystander_iri_pt_judgments_bystander_empathy_perspective_taking.png" id="64" name="Picture"/>
+                    <pic:cNvPr descr="../figures/figure_sig_all_judgments_bystander_participant_engineering_judgments_bystander_engineering_participant_ref_humanities.png" id="65" name="Picture"/>
                     <pic:cNvPicPr>
                       <a:picLocks noChangeArrowheads="1" noChangeAspect="1"/>
                     </pic:cNvPicPr>
                   </pic:nvPicPr>
                   <pic:blipFill>
-                    <a:blip r:embed="rId62"/>
+                    <a:blip r:embed="rId63"/>
                     <a:stretch>
                       <a:fillRect/>
                     </a:stretch>
@@ -1759,7 +1685,7 @@
         <w:pStyle w:val="ImageCaption"/>
       </w:pPr>
       <w:r>
-        <w:t xml:space="preserve">Effect Plot for Empathy: Perspective taking in the judgments_bystander. The panels show predicted judgments on the observed -9 to 9 scale with 95% confidence intervals.</w:t>
+        <w:t xml:space="preserve">Grouped Prediction Plot for Engineering participant (ref = humanities) in the judgments_bystander. The panels show predicted judgments on the observed -9 to 9 scale with 95% confidence intervals.</w:t>
       </w:r>
     </w:p>
     <w:p>
@@ -1767,7 +1693,7 @@
         <w:pStyle w:val="BodyText"/>
       </w:pPr>
       <w:r>
-        <w:t xml:space="preserve">Empathy: Fantasy scale is statistically significant in:</w:t>
+        <w:t xml:space="preserve">Counterpart negotiator control label hidden (ref = ingroup) is statistically significant in:</w:t>
       </w:r>
       <w:r>
         <w:t xml:space="preserve"> </w:t>
@@ -1779,7 +1705,7 @@
         <w:t xml:space="preserve"> </w:t>
       </w:r>
       <w:r>
-        <w:t xml:space="preserve">- H2: Judged-status x decision contrasts Model B (Tobit)</w:t>
+        <w:t xml:space="preserve">- H1: Empathy under relational controls Model A (Tobit)</w:t>
       </w:r>
       <w:r>
         <w:t xml:space="preserve"> </w:t>
@@ -1791,7 +1717,13 @@
         <w:t xml:space="preserve"> </w:t>
       </w:r>
       <w:r>
-        <w:t xml:space="preserve">The figure below shows that across the observed range, higher Empathy: Fantasy scale corresponds to lower predicted judgment.</w:t>
+        <w:t xml:space="preserve">- H3: Empathy x judged-status moderation Model A (Tobit)</w:t>
+      </w:r>
+      <w:r>
+        <w:t xml:space="preserve"> </w:t>
+      </w:r>
+      <w:r>
+        <w:t xml:space="preserve">The figure below shows that predicted judgment is higher for Counterpart negotiator control label hidden than for Counterpart negotiator ingroup.</w:t>
       </w:r>
     </w:p>
     <w:p>
@@ -1803,18 +1735,18 @@
           <wp:inline>
             <wp:extent cx="5334000" cy="4000500"/>
             <wp:effectExtent b="0" l="0" r="0" t="0"/>
-            <wp:docPr descr="Effect Plot for Empathy: Fantasy scale in the judgments_bystander. The panels show predicted judgments on the observed -9 to 9 scale with 95% confidence intervals." title="" id="66" name="Picture"/>
+            <wp:docPr descr="Grouped Prediction Plot for Counterpart negotiator control label hidden (ref = ingroup) in the judgments_bystander. The panels show predicted judgments on the observed -9 to 9 scale with 95% confidence intervals." title="" id="67" name="Picture"/>
             <a:graphic>
               <a:graphicData uri="http://schemas.openxmlformats.org/drawingml/2006/picture">
                 <pic:pic>
                   <pic:nvPicPr>
-                    <pic:cNvPr descr="../figures/figure_sig_all_judgments_bystander_iri_fs_judgments_bystander_empathy_fantasy_scale.png" id="67" name="Picture"/>
+                    <pic:cNvPr descr="../figures/figure_sig_all_judgments_bystander_counterpart_control_judgments_bystander_counterpart_negotiator_control_label_hidden_ref_ingroup.png" id="68" name="Picture"/>
                     <pic:cNvPicPr>
                       <a:picLocks noChangeArrowheads="1" noChangeAspect="1"/>
                     </pic:cNvPicPr>
                   </pic:nvPicPr>
                   <pic:blipFill>
-                    <a:blip r:embed="rId65"/>
+                    <a:blip r:embed="rId66"/>
                     <a:stretch>
                       <a:fillRect/>
                     </a:stretch>
@@ -1846,7 +1778,7 @@
         <w:pStyle w:val="ImageCaption"/>
       </w:pPr>
       <w:r>
-        <w:t xml:space="preserve">Effect Plot for Empathy: Fantasy scale in the judgments_bystander. The panels show predicted judgments on the observed -9 to 9 scale with 95% confidence intervals.</w:t>
+        <w:t xml:space="preserve">Grouped Prediction Plot for Counterpart negotiator control label hidden (ref = ingroup) in the judgments_bystander. The panels show predicted judgments on the observed -9 to 9 scale with 95% confidence intervals.</w:t>
       </w:r>
     </w:p>
     <w:p>
@@ -1854,19 +1786,19 @@
         <w:pStyle w:val="BodyText"/>
       </w:pPr>
       <w:r>
-        <w:t xml:space="preserve">Empathy composite (average) is statistically significant in:</w:t>
-      </w:r>
-      <w:r>
-        <w:t xml:space="preserve"> </w:t>
-      </w:r>
-      <w:r>
-        <w:t xml:space="preserve">- H2: Judged-status x decision contrasts Model A (Tobit)</w:t>
-      </w:r>
-      <w:r>
-        <w:t xml:space="preserve"> </w:t>
-      </w:r>
-      <w:r>
-        <w:t xml:space="preserve">The figure below shows that across the observed range, higher Empathy composite (average) corresponds to lower predicted judgment.</w:t>
+        <w:t xml:space="preserve">Empathy: Empathic concern is statistically significant in:</w:t>
+      </w:r>
+      <w:r>
+        <w:t xml:space="preserve"> </w:t>
+      </w:r>
+      <w:r>
+        <w:t xml:space="preserve">- H2: Negotiator-side relational structure Model B (Tobit)</w:t>
+      </w:r>
+      <w:r>
+        <w:t xml:space="preserve"> </w:t>
+      </w:r>
+      <w:r>
+        <w:t xml:space="preserve">The figure below shows that across the observed range, higher Empathy: Empathic concern corresponds to lower predicted judgment.</w:t>
       </w:r>
     </w:p>
     <w:p>
@@ -1878,18 +1810,18 @@
           <wp:inline>
             <wp:extent cx="5334000" cy="4000500"/>
             <wp:effectExtent b="0" l="0" r="0" t="0"/>
-            <wp:docPr descr="Effect Plot for Empathy composite (average) in the judgments_bystander. The panels show predicted judgments on the observed -9 to 9 scale with 95% confidence intervals." title="" id="69" name="Picture"/>
+            <wp:docPr descr="Effect Plot for Empathy: Empathic concern in the judgments_bystander. The panels show predicted judgments on the observed -9 to 9 scale with 95% confidence intervals." title="" id="70" name="Picture"/>
             <a:graphic>
               <a:graphicData uri="http://schemas.openxmlformats.org/drawingml/2006/picture">
                 <pic:pic>
                   <pic:nvPicPr>
-                    <pic:cNvPr descr="../figures/figure_sig_all_judgments_bystander_iri_total_judgments_bystander_empathy_composite_average.png" id="70" name="Picture"/>
+                    <pic:cNvPr descr="../figures/figure_sig_all_judgments_bystander_iri_ec_judgments_bystander_empathy_empathic_concern.png" id="71" name="Picture"/>
                     <pic:cNvPicPr>
                       <a:picLocks noChangeArrowheads="1" noChangeAspect="1"/>
                     </pic:cNvPicPr>
                   </pic:nvPicPr>
                   <pic:blipFill>
-                    <a:blip r:embed="rId68"/>
+                    <a:blip r:embed="rId69"/>
                     <a:stretch>
                       <a:fillRect/>
                     </a:stretch>
@@ -1921,67 +1853,33 @@
         <w:pStyle w:val="ImageCaption"/>
       </w:pPr>
       <w:r>
-        <w:t xml:space="preserve">Effect Plot for Empathy composite (average) in the judgments_bystander. The panels show predicted judgments on the observed -9 to 9 scale with 95% confidence intervals.</w:t>
-      </w:r>
-    </w:p>
-    <w:bookmarkEnd w:id="71"/>
-    <w:bookmarkStart w:id="111" w:name="judgments_victim"/>
-    <w:p>
-      <w:pPr>
-        <w:pStyle w:val="Heading3"/>
-      </w:pPr>
-      <w:r>
-        <w:t xml:space="preserve">judgments_victim</w:t>
-      </w:r>
-    </w:p>
-    <w:p>
-      <w:pPr>
-        <w:pStyle w:val="FirstParagraph"/>
-      </w:pPr>
-      <w:r>
-        <w:t xml:space="preserve">Negotiator accepted harmful deal is statistically significant in:</w:t>
-      </w:r>
-      <w:r>
-        <w:t xml:space="preserve"> </w:t>
-      </w:r>
-      <w:r>
-        <w:t xml:space="preserve">- H1: Empathy under relational controls Model B (Tobit)</w:t>
-      </w:r>
-      <w:r>
-        <w:t xml:space="preserve"> </w:t>
-      </w:r>
-      <w:r>
-        <w:t xml:space="preserve">- H1: Empathy under relational controls Model A (Tobit)</w:t>
-      </w:r>
-      <w:r>
-        <w:t xml:space="preserve"> </w:t>
-      </w:r>
-      <w:r>
-        <w:t xml:space="preserve">- H2: Judged-status x decision contrasts Model B (Tobit)</w:t>
-      </w:r>
-      <w:r>
-        <w:t xml:space="preserve"> </w:t>
-      </w:r>
-      <w:r>
-        <w:t xml:space="preserve">- H3: Empathy x judged-status moderation Model B (Tobit)</w:t>
-      </w:r>
-      <w:r>
-        <w:t xml:space="preserve"> </w:t>
-      </w:r>
-      <w:r>
-        <w:t xml:space="preserve">- H2: Judged-status x decision contrasts Model A (Tobit)</w:t>
-      </w:r>
-      <w:r>
-        <w:t xml:space="preserve"> </w:t>
-      </w:r>
-      <w:r>
-        <w:t xml:space="preserve">- H3: Empathy x judged-status moderation Model A (Tobit)</w:t>
-      </w:r>
-      <w:r>
-        <w:t xml:space="preserve"> </w:t>
-      </w:r>
-      <w:r>
-        <w:t xml:space="preserve">The figure below shows that predicted judgment is lower for Accept harmful deal than for Reject harmful deal.</w:t>
+        <w:t xml:space="preserve">Effect Plot for Empathy: Empathic concern in the judgments_bystander. The panels show predicted judgments on the observed -9 to 9 scale with 95% confidence intervals.</w:t>
+      </w:r>
+    </w:p>
+    <w:p>
+      <w:pPr>
+        <w:pStyle w:val="BodyText"/>
+      </w:pPr>
+      <w:r>
+        <w:t xml:space="preserve">Age is statistically significant in:</w:t>
+      </w:r>
+      <w:r>
+        <w:t xml:space="preserve"> </w:t>
+      </w:r>
+      <w:r>
+        <w:t xml:space="preserve">- H2: Negotiator-side relational structure Model A (Tobit)</w:t>
+      </w:r>
+      <w:r>
+        <w:t xml:space="preserve"> </w:t>
+      </w:r>
+      <w:r>
+        <w:t xml:space="preserve">- H2: Negotiator-side relational structure Model B (Tobit)</w:t>
+      </w:r>
+      <w:r>
+        <w:t xml:space="preserve"> </w:t>
+      </w:r>
+      <w:r>
+        <w:t xml:space="preserve">The figure below shows that across the observed range, higher Age corresponds to higher predicted judgment.</w:t>
       </w:r>
     </w:p>
     <w:p>
@@ -1993,12 +1891,12 @@
           <wp:inline>
             <wp:extent cx="5334000" cy="4000500"/>
             <wp:effectExtent b="0" l="0" r="0" t="0"/>
-            <wp:docPr descr="Grouped Prediction Plot for Negotiator accepted harmful deal in the judgments_victim. The panels show predicted judgments on the observed -9 to 9 scale with 95% confidence intervals." title="" id="73" name="Picture"/>
+            <wp:docPr descr="Effect Plot for Age in the judgments_bystander. The panels show predicted judgments on the observed -9 to 9 scale with 95% confidence intervals." title="" id="73" name="Picture"/>
             <a:graphic>
               <a:graphicData uri="http://schemas.openxmlformats.org/drawingml/2006/picture">
                 <pic:pic>
                   <pic:nvPicPr>
-                    <pic:cNvPr descr="../figures/figure_sig_all_judgments_victim_decision_accept_judgments_victim_negotiator_accepted_harmful_deal.png" id="74" name="Picture"/>
+                    <pic:cNvPr descr="../figures/figure_sig_all_judgments_bystander_age_judgments_bystander_age.png" id="74" name="Picture"/>
                     <pic:cNvPicPr>
                       <a:picLocks noChangeArrowheads="1" noChangeAspect="1"/>
                     </pic:cNvPicPr>
@@ -2036,7 +1934,7 @@
         <w:pStyle w:val="ImageCaption"/>
       </w:pPr>
       <w:r>
-        <w:t xml:space="preserve">Grouped Prediction Plot for Negotiator accepted harmful deal in the judgments_victim. The panels show predicted judgments on the observed -9 to 9 scale with 95% confidence intervals.</w:t>
+        <w:t xml:space="preserve">Effect Plot for Age in the judgments_bystander. The panels show predicted judgments on the observed -9 to 9 scale with 95% confidence intervals.</w:t>
       </w:r>
     </w:p>
     <w:p>
@@ -2044,31 +1942,25 @@
         <w:pStyle w:val="BodyText"/>
       </w:pPr>
       <w:r>
-        <w:t xml:space="preserve">Empathy: Perspective taking is statistically significant in:</w:t>
-      </w:r>
-      <w:r>
-        <w:t xml:space="preserve"> </w:t>
-      </w:r>
-      <w:r>
-        <w:t xml:space="preserve">- H1: Empathy under relational controls Model B (Tobit)</w:t>
-      </w:r>
-      <w:r>
-        <w:t xml:space="preserve"> </w:t>
-      </w:r>
-      <w:r>
-        <w:t xml:space="preserve">- H2: Judged-status x decision contrasts Model B (Tobit)</w:t>
-      </w:r>
-      <w:r>
-        <w:t xml:space="preserve"> </w:t>
-      </w:r>
-      <w:r>
-        <w:t xml:space="preserve">- H3: Empathy x judged-status moderation Model B (Tobit)</w:t>
-      </w:r>
-      <w:r>
-        <w:t xml:space="preserve"> </w:t>
-      </w:r>
-      <w:r>
-        <w:t xml:space="preserve">The figure below shows that across the observed range, higher Empathy: Perspective taking corresponds to higher predicted judgment.</w:t>
+        <w:t xml:space="preserve">Negotiator-side structure: judged negotiator ingroup, counterpart negotiator outgroup (ref = judged negotiator ingroup, counterpart negotiator ingroup) x Player-victim outgroup (ref = ingroup victim) is statistically significant in:</w:t>
+      </w:r>
+      <w:r>
+        <w:t xml:space="preserve"> </w:t>
+      </w:r>
+      <w:r>
+        <w:t xml:space="preserve">- H2: Negotiator-side relational structure Model B (Tobit)</w:t>
+      </w:r>
+      <w:r>
+        <w:t xml:space="preserve"> </w:t>
+      </w:r>
+      <w:r>
+        <w:t xml:space="preserve">- H2: Negotiator-side relational structure Model A (Tobit)</w:t>
+      </w:r>
+      <w:r>
+        <w:t xml:space="preserve"> </w:t>
+      </w:r>
+      <w:r>
+        <w:t xml:space="preserve">The figure below shows that the predicted relationship rises most sharply for Negotiator-side structure: judged negotiator ingroup, counterpart negotiator outgroup (ref = judged negotiator ingroup, counterpart negotiator ingroup) when the condition is Player and victim outgroup-aligned.</w:t>
       </w:r>
     </w:p>
     <w:p>
@@ -2080,12 +1972,12 @@
           <wp:inline>
             <wp:extent cx="5334000" cy="4000500"/>
             <wp:effectExtent b="0" l="0" r="0" t="0"/>
-            <wp:docPr descr="Effect Plot for Empathy: Perspective taking in the judgments_victim. The panels show predicted judgments on the observed -9 to 9 scale with 95% confidence intervals." title="" id="76" name="Picture"/>
+            <wp:docPr descr="Interaction Plot for Negotiator-side structure: judged negotiator ingroup, counterpart negotiator outgroup (ref = judged negotiator ingroup, counterpart negotiator ingroup) x Player-victim outgroup (ref = ingroup victim) in the judgments_bystander. The panels show predicted judgments on the observed -9 to 9 scale with 95% confidence intervals." title="" id="76" name="Picture"/>
             <a:graphic>
               <a:graphicData uri="http://schemas.openxmlformats.org/drawingml/2006/picture">
                 <pic:pic>
                   <pic:nvPicPr>
-                    <pic:cNvPr descr="../figures/figure_sig_all_judgments_victim_iri_pt_judgments_victim_empathy_perspective_taking.png" id="77" name="Picture"/>
+                    <pic:cNvPr descr="../figures/figure_sig_all_judgments_bystander_h2_negstruct_j_in_c_out_player_victim_outgroup_judgments_bystander_negotiator_side_structure_judged_negotiator_ingroup_counterpart_negoti.png" id="77" name="Picture"/>
                     <pic:cNvPicPr>
                       <a:picLocks noChangeArrowheads="1" noChangeAspect="1"/>
                     </pic:cNvPicPr>
@@ -2123,7 +2015,7 @@
         <w:pStyle w:val="ImageCaption"/>
       </w:pPr>
       <w:r>
-        <w:t xml:space="preserve">Effect Plot for Empathy: Perspective taking in the judgments_victim. The panels show predicted judgments on the observed -9 to 9 scale with 95% confidence intervals.</w:t>
+        <w:t xml:space="preserve">Interaction Plot for Negotiator-side structure: judged negotiator ingroup, counterpart negotiator outgroup (ref = judged negotiator ingroup, counterpart negotiator ingroup) x Player-victim outgroup (ref = ingroup victim) in the judgments_bystander. The panels show predicted judgments on the observed -9 to 9 scale with 95% confidence intervals.</w:t>
       </w:r>
     </w:p>
     <w:p>
@@ -2131,13 +2023,7 @@
         <w:pStyle w:val="BodyText"/>
       </w:pPr>
       <w:r>
-        <w:t xml:space="preserve">Empathy: Empathic concern is statistically significant in:</w:t>
-      </w:r>
-      <w:r>
-        <w:t xml:space="preserve"> </w:t>
-      </w:r>
-      <w:r>
-        <w:t xml:space="preserve">- H2: Judged-status x decision contrasts Model B (Tobit)</w:t>
+        <w:t xml:space="preserve">Empathy: Perspective taking is statistically significant in:</w:t>
       </w:r>
       <w:r>
         <w:t xml:space="preserve"> </w:t>
@@ -2149,7 +2035,19 @@
         <w:t xml:space="preserve"> </w:t>
       </w:r>
       <w:r>
-        <w:t xml:space="preserve">The figure below shows that across the observed range, higher Empathy: Empathic concern corresponds to lower predicted judgment.</w:t>
+        <w:t xml:space="preserve">- H2: Negotiator-side relational structure Model B (Tobit)</w:t>
+      </w:r>
+      <w:r>
+        <w:t xml:space="preserve"> </w:t>
+      </w:r>
+      <w:r>
+        <w:t xml:space="preserve">- H3: Empathy x judged-status moderation Model B (Tobit)</w:t>
+      </w:r>
+      <w:r>
+        <w:t xml:space="preserve"> </w:t>
+      </w:r>
+      <w:r>
+        <w:t xml:space="preserve">The figure below shows that across the observed range, higher Empathy: Perspective taking corresponds to higher predicted judgment.</w:t>
       </w:r>
     </w:p>
     <w:p>
@@ -2161,12 +2059,12 @@
           <wp:inline>
             <wp:extent cx="5334000" cy="4000500"/>
             <wp:effectExtent b="0" l="0" r="0" t="0"/>
-            <wp:docPr descr="Effect Plot for Empathy: Empathic concern in the judgments_victim. The panels show predicted judgments on the observed -9 to 9 scale with 95% confidence intervals." title="" id="79" name="Picture"/>
+            <wp:docPr descr="Effect Plot for Empathy: Perspective taking in the judgments_bystander. The panels show predicted judgments on the observed -9 to 9 scale with 95% confidence intervals." title="" id="79" name="Picture"/>
             <a:graphic>
               <a:graphicData uri="http://schemas.openxmlformats.org/drawingml/2006/picture">
                 <pic:pic>
                   <pic:nvPicPr>
-                    <pic:cNvPr descr="../figures/figure_sig_all_judgments_victim_iri_ec_judgments_victim_empathy_empathic_concern.png" id="80" name="Picture"/>
+                    <pic:cNvPr descr="../figures/figure_sig_all_judgments_bystander_iri_pt_judgments_bystander_empathy_perspective_taking.png" id="80" name="Picture"/>
                     <pic:cNvPicPr>
                       <a:picLocks noChangeArrowheads="1" noChangeAspect="1"/>
                     </pic:cNvPicPr>
@@ -2204,7 +2102,7 @@
         <w:pStyle w:val="ImageCaption"/>
       </w:pPr>
       <w:r>
-        <w:t xml:space="preserve">Effect Plot for Empathy: Empathic concern in the judgments_victim. The panels show predicted judgments on the observed -9 to 9 scale with 95% confidence intervals.</w:t>
+        <w:t xml:space="preserve">Effect Plot for Empathy: Perspective taking in the judgments_bystander. The panels show predicted judgments on the observed -9 to 9 scale with 95% confidence intervals.</w:t>
       </w:r>
     </w:p>
     <w:p>
@@ -2212,7 +2110,19 @@
         <w:pStyle w:val="BodyText"/>
       </w:pPr>
       <w:r>
-        <w:t xml:space="preserve">Judged negotiator outgroup (ref = ingroup) is statistically significant in:</w:t>
+        <w:t xml:space="preserve">Empathy: Fantasy scale is statistically significant in:</w:t>
+      </w:r>
+      <w:r>
+        <w:t xml:space="preserve"> </w:t>
+      </w:r>
+      <w:r>
+        <w:t xml:space="preserve">- H2: Negotiator-side relational structure Model B (Tobit)</w:t>
+      </w:r>
+      <w:r>
+        <w:t xml:space="preserve"> </w:t>
+      </w:r>
+      <w:r>
+        <w:t xml:space="preserve">- H1: Empathy under relational controls Model B (Tobit)</w:t>
       </w:r>
       <w:r>
         <w:t xml:space="preserve"> </w:t>
@@ -2224,13 +2134,7 @@
         <w:t xml:space="preserve"> </w:t>
       </w:r>
       <w:r>
-        <w:t xml:space="preserve">- H3: Empathy x judged-status moderation Model A (Tobit)</w:t>
-      </w:r>
-      <w:r>
-        <w:t xml:space="preserve"> </w:t>
-      </w:r>
-      <w:r>
-        <w:t xml:space="preserve">The figure below shows that predicted judgment is higher for Judged negotiator outgroup than for Judged negotiator ingroup.</w:t>
+        <w:t xml:space="preserve">The figure below shows that across the observed range, higher Empathy: Fantasy scale corresponds to lower predicted judgment.</w:t>
       </w:r>
     </w:p>
     <w:p>
@@ -2242,12 +2146,12 @@
           <wp:inline>
             <wp:extent cx="5334000" cy="4000500"/>
             <wp:effectExtent b="0" l="0" r="0" t="0"/>
-            <wp:docPr descr="Grouped Prediction Plot for Judged negotiator outgroup (ref = ingroup) in the judgments_victim. The panels show predicted judgments on the observed -9 to 9 scale with 95% confidence intervals." title="" id="82" name="Picture"/>
+            <wp:docPr descr="Effect Plot for Empathy: Fantasy scale in the judgments_bystander. The panels show predicted judgments on the observed -9 to 9 scale with 95% confidence intervals." title="" id="82" name="Picture"/>
             <a:graphic>
               <a:graphicData uri="http://schemas.openxmlformats.org/drawingml/2006/picture">
                 <pic:pic>
                   <pic:nvPicPr>
-                    <pic:cNvPr descr="../figures/figure_sig_all_judgments_victim_judged_outgroup_judgments_victim_judged_negotiator_outgroup_ref_ingroup.png" id="83" name="Picture"/>
+                    <pic:cNvPr descr="../figures/figure_sig_all_judgments_bystander_iri_fs_judgments_bystander_empathy_fantasy_scale.png" id="83" name="Picture"/>
                     <pic:cNvPicPr>
                       <a:picLocks noChangeArrowheads="1" noChangeAspect="1"/>
                     </pic:cNvPicPr>
@@ -2285,7 +2189,7 @@
         <w:pStyle w:val="ImageCaption"/>
       </w:pPr>
       <w:r>
-        <w:t xml:space="preserve">Grouped Prediction Plot for Judged negotiator outgroup (ref = ingroup) in the judgments_victim. The panels show predicted judgments on the observed -9 to 9 scale with 95% confidence intervals.</w:t>
+        <w:t xml:space="preserve">Effect Plot for Empathy: Fantasy scale in the judgments_bystander. The panels show predicted judgments on the observed -9 to 9 scale with 95% confidence intervals.</w:t>
       </w:r>
     </w:p>
     <w:p>
@@ -2293,19 +2197,25 @@
         <w:pStyle w:val="BodyText"/>
       </w:pPr>
       <w:r>
-        <w:t xml:space="preserve">Personal distress x judged negotiator outgroup is statistically significant in:</w:t>
-      </w:r>
-      <w:r>
-        <w:t xml:space="preserve"> </w:t>
-      </w:r>
-      <w:r>
-        <w:t xml:space="preserve">- H3: Empathy x judged-status moderation Model B (Tobit)</w:t>
-      </w:r>
-      <w:r>
-        <w:t xml:space="preserve"> </w:t>
-      </w:r>
-      <w:r>
-        <w:t xml:space="preserve">The figure below shows that the predicted relationship rises most sharply for Empathy: Personal distress when the condition is Judged negotiator outgroup.</w:t>
+        <w:t xml:space="preserve">Negotiator-side structure: judged negotiator outgroup, counterpart negotiator ingroup (ref = judged negotiator ingroup, counterpart negotiator ingroup) is statistically significant in:</w:t>
+      </w:r>
+      <w:r>
+        <w:t xml:space="preserve"> </w:t>
+      </w:r>
+      <w:r>
+        <w:t xml:space="preserve">- H2: Negotiator-side relational structure Model A (Tobit)</w:t>
+      </w:r>
+      <w:r>
+        <w:t xml:space="preserve"> </w:t>
+      </w:r>
+      <w:r>
+        <w:t xml:space="preserve">- H2: Negotiator-side relational structure Model B (Tobit)</w:t>
+      </w:r>
+      <w:r>
+        <w:t xml:space="preserve"> </w:t>
+      </w:r>
+      <w:r>
+        <w:t xml:space="preserve">The figure below shows that predicted judgment is lower for judged negotiator outgroup, counterpart negotiator ingroup (ref = judged negotiator ingroup, counterpart negotiator ingroup) than for Reference structure: judged ingroup, counterpart ingroup.</w:t>
       </w:r>
     </w:p>
     <w:p>
@@ -2317,12 +2227,12 @@
           <wp:inline>
             <wp:extent cx="5334000" cy="4000500"/>
             <wp:effectExtent b="0" l="0" r="0" t="0"/>
-            <wp:docPr descr="Interaction Plot for Personal distress x judged negotiator outgroup in the judgments_victim. The panels show predicted judgments on the observed -9 to 9 scale with 95% confidence intervals." title="" id="85" name="Picture"/>
+            <wp:docPr descr="Grouped Prediction Plot for Negotiator-side structure: judged negotiator outgroup, counterpart negotiator ingroup (ref = judged negotiator ingroup, counterpart negotiator ingroup) in the judgments_bystander. The panels show predicted judgments on the observed -9 to 9 scale with 95% confidence intervals." title="" id="85" name="Picture"/>
             <a:graphic>
               <a:graphicData uri="http://schemas.openxmlformats.org/drawingml/2006/picture">
                 <pic:pic>
                   <pic:nvPicPr>
-                    <pic:cNvPr descr="../figures/figure_sig_all_judgments_victim_iri_pd_judged_outgroup_judgments_victim_personal_distress_x_judged_negotiator_outgroup.png" id="86" name="Picture"/>
+                    <pic:cNvPr descr="../figures/figure_sig_all_judgments_bystander_h2_negstruct_j_out_c_in_judgments_bystander_negotiator_side_structure_judged_negotiator_outgroup_counterpart_negot.png" id="86" name="Picture"/>
                     <pic:cNvPicPr>
                       <a:picLocks noChangeArrowheads="1" noChangeAspect="1"/>
                     </pic:cNvPicPr>
@@ -2360,7 +2270,7 @@
         <w:pStyle w:val="ImageCaption"/>
       </w:pPr>
       <w:r>
-        <w:t xml:space="preserve">Interaction Plot for Personal distress x judged negotiator outgroup in the judgments_victim. The panels show predicted judgments on the observed -9 to 9 scale with 95% confidence intervals.</w:t>
+        <w:t xml:space="preserve">Grouped Prediction Plot for Negotiator-side structure: judged negotiator outgroup, counterpart negotiator ingroup (ref = judged negotiator ingroup, counterpart negotiator ingroup) in the judgments_bystander. The panels show predicted judgments on the observed -9 to 9 scale with 95% confidence intervals.</w:t>
       </w:r>
     </w:p>
     <w:p>
@@ -2368,19 +2278,19 @@
         <w:pStyle w:val="BodyText"/>
       </w:pPr>
       <w:r>
-        <w:t xml:space="preserve">Empathic concern x judged negotiator outgroup is statistically significant in:</w:t>
-      </w:r>
-      <w:r>
-        <w:t xml:space="preserve"> </w:t>
-      </w:r>
-      <w:r>
-        <w:t xml:space="preserve">- H3: Empathy x judged-status moderation Model B (Tobit)</w:t>
-      </w:r>
-      <w:r>
-        <w:t xml:space="preserve"> </w:t>
-      </w:r>
-      <w:r>
-        <w:t xml:space="preserve">The figure below shows that the predicted relationship falls most sharply for Empathy: Empathic concern when the condition is Judged negotiator outgroup.</w:t>
+        <w:t xml:space="preserve">Empathy: Personal distress is statistically significant in:</w:t>
+      </w:r>
+      <w:r>
+        <w:t xml:space="preserve"> </w:t>
+      </w:r>
+      <w:r>
+        <w:t xml:space="preserve">- H2: Negotiator-side relational structure Model B (Tobit)</w:t>
+      </w:r>
+      <w:r>
+        <w:t xml:space="preserve"> </w:t>
+      </w:r>
+      <w:r>
+        <w:t xml:space="preserve">The figure below shows that across the observed range, higher Empathy: Personal distress corresponds to higher predicted judgment.</w:t>
       </w:r>
     </w:p>
     <w:p>
@@ -2392,12 +2302,12 @@
           <wp:inline>
             <wp:extent cx="5334000" cy="4000500"/>
             <wp:effectExtent b="0" l="0" r="0" t="0"/>
-            <wp:docPr descr="Interaction Plot for Empathic concern x judged negotiator outgroup in the judgments_victim. The panels show predicted judgments on the observed -9 to 9 scale with 95% confidence intervals." title="" id="88" name="Picture"/>
+            <wp:docPr descr="Effect Plot for Empathy: Personal distress in the judgments_bystander. The panels show predicted judgments on the observed -9 to 9 scale with 95% confidence intervals." title="" id="88" name="Picture"/>
             <a:graphic>
               <a:graphicData uri="http://schemas.openxmlformats.org/drawingml/2006/picture">
                 <pic:pic>
                   <pic:nvPicPr>
-                    <pic:cNvPr descr="../figures/figure_sig_all_judgments_victim_iri_ec_judged_outgroup_judgments_victim_empathic_concern_x_judged_negotiator_outgroup.png" id="89" name="Picture"/>
+                    <pic:cNvPr descr="../figures/figure_sig_all_judgments_bystander_iri_pd_judgments_bystander_empathy_personal_distress.png" id="89" name="Picture"/>
                     <pic:cNvPicPr>
                       <a:picLocks noChangeArrowheads="1" noChangeAspect="1"/>
                     </pic:cNvPicPr>
@@ -2435,7 +2345,7 @@
         <w:pStyle w:val="ImageCaption"/>
       </w:pPr>
       <w:r>
-        <w:t xml:space="preserve">Interaction Plot for Empathic concern x judged negotiator outgroup in the judgments_victim. The panels show predicted judgments on the observed -9 to 9 scale with 95% confidence intervals.</w:t>
+        <w:t xml:space="preserve">Effect Plot for Empathy: Personal distress in the judgments_bystander. The panels show predicted judgments on the observed -9 to 9 scale with 95% confidence intervals.</w:t>
       </w:r>
     </w:p>
     <w:p>
@@ -2443,49 +2353,19 @@
         <w:pStyle w:val="BodyText"/>
       </w:pPr>
       <w:r>
-        <w:t xml:space="preserve">Engineering participant (ref = humanities) is statistically significant in:</w:t>
-      </w:r>
-      <w:r>
-        <w:t xml:space="preserve"> </w:t>
-      </w:r>
-      <w:r>
-        <w:t xml:space="preserve">- H3: Empathy x judged-status moderation Model A (Tobit)</w:t>
-      </w:r>
-      <w:r>
-        <w:t xml:space="preserve"> </w:t>
-      </w:r>
-      <w:r>
-        <w:t xml:space="preserve">- H1: Empathy under relational controls Model A (Tobit)</w:t>
-      </w:r>
-      <w:r>
-        <w:t xml:space="preserve"> </w:t>
-      </w:r>
-      <w:r>
-        <w:t xml:space="preserve">- H3: Empathy x judged-status moderation Model B (Tobit)</w:t>
-      </w:r>
-      <w:r>
-        <w:t xml:space="preserve"> </w:t>
-      </w:r>
-      <w:r>
-        <w:t xml:space="preserve">- H1: Empathy under relational controls Model B (Tobit)</w:t>
-      </w:r>
-      <w:r>
-        <w:t xml:space="preserve"> </w:t>
-      </w:r>
-      <w:r>
-        <w:t xml:space="preserve">- H2: Judged-status x decision contrasts Model A (Tobit)</w:t>
-      </w:r>
-      <w:r>
-        <w:t xml:space="preserve"> </w:t>
-      </w:r>
-      <w:r>
-        <w:t xml:space="preserve">- H2: Judged-status x decision contrasts Model B (Tobit)</w:t>
-      </w:r>
-      <w:r>
-        <w:t xml:space="preserve"> </w:t>
-      </w:r>
-      <w:r>
-        <w:t xml:space="preserve">The figure below shows that predicted judgment is higher for Engineering participant than for Humanities participant.</w:t>
+        <w:t xml:space="preserve">Empathy composite (average) is statistically significant in:</w:t>
+      </w:r>
+      <w:r>
+        <w:t xml:space="preserve"> </w:t>
+      </w:r>
+      <w:r>
+        <w:t xml:space="preserve">- H2: Negotiator-side relational structure Model A (Tobit)</w:t>
+      </w:r>
+      <w:r>
+        <w:t xml:space="preserve"> </w:t>
+      </w:r>
+      <w:r>
+        <w:t xml:space="preserve">The figure below shows that across the observed range, higher Empathy composite (average) corresponds to lower predicted judgment.</w:t>
       </w:r>
     </w:p>
     <w:p>
@@ -2497,12 +2377,12 @@
           <wp:inline>
             <wp:extent cx="5334000" cy="4000500"/>
             <wp:effectExtent b="0" l="0" r="0" t="0"/>
-            <wp:docPr descr="Grouped Prediction Plot for Engineering participant (ref = humanities) in the judgments_victim. The panels show predicted judgments on the observed -9 to 9 scale with 95% confidence intervals." title="" id="91" name="Picture"/>
+            <wp:docPr descr="Effect Plot for Empathy composite (average) in the judgments_bystander. The panels show predicted judgments on the observed -9 to 9 scale with 95% confidence intervals." title="" id="91" name="Picture"/>
             <a:graphic>
               <a:graphicData uri="http://schemas.openxmlformats.org/drawingml/2006/picture">
                 <pic:pic>
                   <pic:nvPicPr>
-                    <pic:cNvPr descr="../figures/figure_sig_all_judgments_victim_participant_engineering_judgments_victim_engineering_participant_ref_humanities.png" id="92" name="Picture"/>
+                    <pic:cNvPr descr="../figures/figure_sig_all_judgments_bystander_iri_total_judgments_bystander_empathy_composite_average.png" id="92" name="Picture"/>
                     <pic:cNvPicPr>
                       <a:picLocks noChangeArrowheads="1" noChangeAspect="1"/>
                     </pic:cNvPicPr>
@@ -2540,7 +2420,7 @@
         <w:pStyle w:val="ImageCaption"/>
       </w:pPr>
       <w:r>
-        <w:t xml:space="preserve">Grouped Prediction Plot for Engineering participant (ref = humanities) in the judgments_victim. The panels show predicted judgments on the observed -9 to 9 scale with 95% confidence intervals.</w:t>
+        <w:t xml:space="preserve">Effect Plot for Empathy composite (average) in the judgments_bystander. The panels show predicted judgments on the observed -9 to 9 scale with 95% confidence intervals.</w:t>
       </w:r>
     </w:p>
     <w:p>
@@ -2548,25 +2428,19 @@
         <w:pStyle w:val="BodyText"/>
       </w:pPr>
       <w:r>
-        <w:t xml:space="preserve">Empathy composite (average) is statistically significant in:</w:t>
-      </w:r>
-      <w:r>
-        <w:t xml:space="preserve"> </w:t>
-      </w:r>
-      <w:r>
-        <w:t xml:space="preserve">- H3: Empathy x judged-status moderation Model A (Tobit)</w:t>
-      </w:r>
-      <w:r>
-        <w:t xml:space="preserve"> </w:t>
-      </w:r>
-      <w:r>
-        <w:t xml:space="preserve">- H2: Judged-status x decision contrasts Model A (Tobit)</w:t>
-      </w:r>
-      <w:r>
-        <w:t xml:space="preserve"> </w:t>
-      </w:r>
-      <w:r>
-        <w:t xml:space="preserve">The figure below shows that across the observed range, higher Empathy composite (average) corresponds to higher predicted judgment.</w:t>
+        <w:t xml:space="preserve">Man (ref = woman) is statistically significant in:</w:t>
+      </w:r>
+      <w:r>
+        <w:t xml:space="preserve"> </w:t>
+      </w:r>
+      <w:r>
+        <w:t xml:space="preserve">- H2: Negotiator-side relational structure Model B (Tobit)</w:t>
+      </w:r>
+      <w:r>
+        <w:t xml:space="preserve"> </w:t>
+      </w:r>
+      <w:r>
+        <w:t xml:space="preserve">The figure below shows that predicted judgment is higher for Man than for Woman.</w:t>
       </w:r>
     </w:p>
     <w:p>
@@ -2578,12 +2452,12 @@
           <wp:inline>
             <wp:extent cx="5334000" cy="4000500"/>
             <wp:effectExtent b="0" l="0" r="0" t="0"/>
-            <wp:docPr descr="Effect Plot for Empathy composite (average) in the judgments_victim. The panels show predicted judgments on the observed -9 to 9 scale with 95% confidence intervals." title="" id="94" name="Picture"/>
+            <wp:docPr descr="Grouped Prediction Plot for Man (ref = woman) in the judgments_bystander. The panels show predicted judgments on the observed -9 to 9 scale with 95% confidence intervals." title="" id="94" name="Picture"/>
             <a:graphic>
               <a:graphicData uri="http://schemas.openxmlformats.org/drawingml/2006/picture">
                 <pic:pic>
                   <pic:nvPicPr>
-                    <pic:cNvPr descr="../figures/figure_sig_all_judgments_victim_iri_total_judgments_victim_empathy_composite_average.png" id="95" name="Picture"/>
+                    <pic:cNvPr descr="../figures/figure_sig_all_judgments_bystander_sex_man_judgments_bystander_man_ref_woman.png" id="95" name="Picture"/>
                     <pic:cNvPicPr>
                       <a:picLocks noChangeArrowheads="1" noChangeAspect="1"/>
                     </pic:cNvPicPr>
@@ -2621,15 +2495,43 @@
         <w:pStyle w:val="ImageCaption"/>
       </w:pPr>
       <w:r>
-        <w:t xml:space="preserve">Effect Plot for Empathy composite (average) in the judgments_victim. The panels show predicted judgments on the observed -9 to 9 scale with 95% confidence intervals.</w:t>
-      </w:r>
-    </w:p>
-    <w:p>
-      <w:pPr>
-        <w:pStyle w:val="BodyText"/>
-      </w:pPr>
-      <w:r>
-        <w:t xml:space="preserve">Empathy x judged negotiator outgroup is statistically significant in:</w:t>
+        <w:t xml:space="preserve">Grouped Prediction Plot for Man (ref = woman) in the judgments_bystander. The panels show predicted judgments on the observed -9 to 9 scale with 95% confidence intervals.</w:t>
+      </w:r>
+    </w:p>
+    <w:bookmarkEnd w:id="96"/>
+    <w:bookmarkStart w:id="139" w:name="judgments_victim"/>
+    <w:p>
+      <w:pPr>
+        <w:pStyle w:val="Heading3"/>
+      </w:pPr>
+      <w:r>
+        <w:t xml:space="preserve">judgments_victim</w:t>
+      </w:r>
+    </w:p>
+    <w:p>
+      <w:pPr>
+        <w:pStyle w:val="FirstParagraph"/>
+      </w:pPr>
+      <w:r>
+        <w:t xml:space="preserve">Negotiator accepted harmful deal is statistically significant in:</w:t>
+      </w:r>
+      <w:r>
+        <w:t xml:space="preserve"> </w:t>
+      </w:r>
+      <w:r>
+        <w:t xml:space="preserve">- H1: Empathy under relational controls Model B (Tobit)</w:t>
+      </w:r>
+      <w:r>
+        <w:t xml:space="preserve"> </w:t>
+      </w:r>
+      <w:r>
+        <w:t xml:space="preserve">- H1: Empathy under relational controls Model A (Tobit)</w:t>
+      </w:r>
+      <w:r>
+        <w:t xml:space="preserve"> </w:t>
+      </w:r>
+      <w:r>
+        <w:t xml:space="preserve">- H3: Empathy x judged-status moderation Model B (Tobit)</w:t>
       </w:r>
       <w:r>
         <w:t xml:space="preserve"> </w:t>
@@ -2641,7 +2543,7 @@
         <w:t xml:space="preserve"> </w:t>
       </w:r>
       <w:r>
-        <w:t xml:space="preserve">The figure below shows that the predicted relationship rises most sharply for Empathy composite (average) when the condition is Judged negotiator ingroup.</w:t>
+        <w:t xml:space="preserve">The figure below shows that predicted judgment is lower for Accept harmful deal than for Reject harmful deal.</w:t>
       </w:r>
     </w:p>
     <w:p>
@@ -2653,18 +2555,18 @@
           <wp:inline>
             <wp:extent cx="5334000" cy="4000500"/>
             <wp:effectExtent b="0" l="0" r="0" t="0"/>
-            <wp:docPr descr="Interaction Plot for Empathy x judged negotiator outgroup in the judgments_victim. The panels show predicted judgments on the observed -9 to 9 scale with 95% confidence intervals." title="" id="97" name="Picture"/>
+            <wp:docPr descr="Grouped Prediction Plot for Negotiator accepted harmful deal in the judgments_victim. The panels show predicted judgments on the observed -9 to 9 scale with 95% confidence intervals." title="" id="98" name="Picture"/>
             <a:graphic>
               <a:graphicData uri="http://schemas.openxmlformats.org/drawingml/2006/picture">
                 <pic:pic>
                   <pic:nvPicPr>
-                    <pic:cNvPr descr="../figures/figure_sig_all_judgments_victim_iri_total_judged_outgroup_judgments_victim_empathy_x_judged_negotiator_outgroup.png" id="98" name="Picture"/>
+                    <pic:cNvPr descr="../figures/figure_sig_all_judgments_victim_decision_accept_judgments_victim_negotiator_accepted_harmful_deal.png" id="99" name="Picture"/>
                     <pic:cNvPicPr>
                       <a:picLocks noChangeArrowheads="1" noChangeAspect="1"/>
                     </pic:cNvPicPr>
                   </pic:nvPicPr>
                   <pic:blipFill>
-                    <a:blip r:embed="rId96"/>
+                    <a:blip r:embed="rId97"/>
                     <a:stretch>
                       <a:fillRect/>
                     </a:stretch>
@@ -2696,7 +2598,7 @@
         <w:pStyle w:val="ImageCaption"/>
       </w:pPr>
       <w:r>
-        <w:t xml:space="preserve">Interaction Plot for Empathy x judged negotiator outgroup in the judgments_victim. The panels show predicted judgments on the observed -9 to 9 scale with 95% confidence intervals.</w:t>
+        <w:t xml:space="preserve">Grouped Prediction Plot for Negotiator accepted harmful deal in the judgments_victim. The panels show predicted judgments on the observed -9 to 9 scale with 95% confidence intervals.</w:t>
       </w:r>
     </w:p>
     <w:p>
@@ -2704,13 +2606,13 @@
         <w:pStyle w:val="BodyText"/>
       </w:pPr>
       <w:r>
-        <w:t xml:space="preserve">Empathy: Personal distress is statistically significant in:</w:t>
-      </w:r>
-      <w:r>
-        <w:t xml:space="preserve"> </w:t>
-      </w:r>
-      <w:r>
-        <w:t xml:space="preserve">- H2: Judged-status x decision contrasts Model B (Tobit)</w:t>
+        <w:t xml:space="preserve">Empathy: Perspective taking is statistically significant in:</w:t>
+      </w:r>
+      <w:r>
+        <w:t xml:space="preserve"> </w:t>
+      </w:r>
+      <w:r>
+        <w:t xml:space="preserve">- H2: Negotiator-side relational structure Model B (Tobit)</w:t>
       </w:r>
       <w:r>
         <w:t xml:space="preserve"> </w:t>
@@ -2722,7 +2624,13 @@
         <w:t xml:space="preserve"> </w:t>
       </w:r>
       <w:r>
-        <w:t xml:space="preserve">The figure below shows that across the observed range, higher Empathy: Personal distress corresponds to higher predicted judgment.</w:t>
+        <w:t xml:space="preserve">- H3: Empathy x judged-status moderation Model B (Tobit)</w:t>
+      </w:r>
+      <w:r>
+        <w:t xml:space="preserve"> </w:t>
+      </w:r>
+      <w:r>
+        <w:t xml:space="preserve">The figure below shows that across the observed range, higher Empathy: Perspective taking corresponds to higher predicted judgment.</w:t>
       </w:r>
     </w:p>
     <w:p>
@@ -2734,18 +2642,18 @@
           <wp:inline>
             <wp:extent cx="5334000" cy="4000500"/>
             <wp:effectExtent b="0" l="0" r="0" t="0"/>
-            <wp:docPr descr="Effect Plot for Empathy: Personal distress in the judgments_victim. The panels show predicted judgments on the observed -9 to 9 scale with 95% confidence intervals." title="" id="100" name="Picture"/>
+            <wp:docPr descr="Effect Plot for Empathy: Perspective taking in the judgments_victim. The panels show predicted judgments on the observed -9 to 9 scale with 95% confidence intervals." title="" id="101" name="Picture"/>
             <a:graphic>
               <a:graphicData uri="http://schemas.openxmlformats.org/drawingml/2006/picture">
                 <pic:pic>
                   <pic:nvPicPr>
-                    <pic:cNvPr descr="../figures/figure_sig_all_judgments_victim_iri_pd_judgments_victim_empathy_personal_distress.png" id="101" name="Picture"/>
+                    <pic:cNvPr descr="../figures/figure_sig_all_judgments_victim_iri_pt_judgments_victim_empathy_perspective_taking.png" id="102" name="Picture"/>
                     <pic:cNvPicPr>
                       <a:picLocks noChangeArrowheads="1" noChangeAspect="1"/>
                     </pic:cNvPicPr>
                   </pic:nvPicPr>
                   <pic:blipFill>
-                    <a:blip r:embed="rId99"/>
+                    <a:blip r:embed="rId100"/>
                     <a:stretch>
                       <a:fillRect/>
                     </a:stretch>
@@ -2777,7 +2685,7 @@
         <w:pStyle w:val="ImageCaption"/>
       </w:pPr>
       <w:r>
-        <w:t xml:space="preserve">Effect Plot for Empathy: Personal distress in the judgments_victim. The panels show predicted judgments on the observed -9 to 9 scale with 95% confidence intervals.</w:t>
+        <w:t xml:space="preserve">Effect Plot for Empathy: Perspective taking in the judgments_victim. The panels show predicted judgments on the observed -9 to 9 scale with 95% confidence intervals.</w:t>
       </w:r>
     </w:p>
     <w:p>
@@ -2785,31 +2693,25 @@
         <w:pStyle w:val="BodyText"/>
       </w:pPr>
       <w:r>
-        <w:t xml:space="preserve">Age is statistically significant in:</w:t>
-      </w:r>
-      <w:r>
-        <w:t xml:space="preserve"> </w:t>
-      </w:r>
-      <w:r>
-        <w:t xml:space="preserve">- H3: Empathy x judged-status moderation Model A (Tobit)</w:t>
-      </w:r>
-      <w:r>
-        <w:t xml:space="preserve"> </w:t>
-      </w:r>
-      <w:r>
-        <w:t xml:space="preserve">- H2: Judged-status x decision contrasts Model A (Tobit)</w:t>
-      </w:r>
-      <w:r>
-        <w:t xml:space="preserve"> </w:t>
-      </w:r>
-      <w:r>
-        <w:t xml:space="preserve">- H1: Empathy under relational controls Model A (Tobit)</w:t>
-      </w:r>
-      <w:r>
-        <w:t xml:space="preserve"> </w:t>
-      </w:r>
-      <w:r>
-        <w:t xml:space="preserve">The figure below shows that across the observed range, higher Age corresponds to higher predicted judgment.</w:t>
+        <w:t xml:space="preserve">Empathy: Empathic concern is statistically significant in:</w:t>
+      </w:r>
+      <w:r>
+        <w:t xml:space="preserve"> </w:t>
+      </w:r>
+      <w:r>
+        <w:t xml:space="preserve">- H2: Negotiator-side relational structure Model B (Tobit)</w:t>
+      </w:r>
+      <w:r>
+        <w:t xml:space="preserve"> </w:t>
+      </w:r>
+      <w:r>
+        <w:t xml:space="preserve">- H1: Empathy under relational controls Model B (Tobit)</w:t>
+      </w:r>
+      <w:r>
+        <w:t xml:space="preserve"> </w:t>
+      </w:r>
+      <w:r>
+        <w:t xml:space="preserve">The figure below shows that across the observed range, higher Empathy: Empathic concern corresponds to lower predicted judgment.</w:t>
       </w:r>
     </w:p>
     <w:p>
@@ -2821,18 +2723,18 @@
           <wp:inline>
             <wp:extent cx="5334000" cy="4000500"/>
             <wp:effectExtent b="0" l="0" r="0" t="0"/>
-            <wp:docPr descr="Effect Plot for Age in the judgments_victim. The panels show predicted judgments on the observed -9 to 9 scale with 95% confidence intervals." title="" id="103" name="Picture"/>
+            <wp:docPr descr="Effect Plot for Empathy: Empathic concern in the judgments_victim. The panels show predicted judgments on the observed -9 to 9 scale with 95% confidence intervals." title="" id="104" name="Picture"/>
             <a:graphic>
               <a:graphicData uri="http://schemas.openxmlformats.org/drawingml/2006/picture">
                 <pic:pic>
                   <pic:nvPicPr>
-                    <pic:cNvPr descr="../figures/figure_sig_all_judgments_victim_age_judgments_victim_age.png" id="104" name="Picture"/>
+                    <pic:cNvPr descr="../figures/figure_sig_all_judgments_victim_iri_ec_judgments_victim_empathy_empathic_concern.png" id="105" name="Picture"/>
                     <pic:cNvPicPr>
                       <a:picLocks noChangeArrowheads="1" noChangeAspect="1"/>
                     </pic:cNvPicPr>
                   </pic:nvPicPr>
                   <pic:blipFill>
-                    <a:blip r:embed="rId102"/>
+                    <a:blip r:embed="rId103"/>
                     <a:stretch>
                       <a:fillRect/>
                     </a:stretch>
@@ -2864,7 +2766,7 @@
         <w:pStyle w:val="ImageCaption"/>
       </w:pPr>
       <w:r>
-        <w:t xml:space="preserve">Effect Plot for Age in the judgments_victim. The panels show predicted judgments on the observed -9 to 9 scale with 95% confidence intervals.</w:t>
+        <w:t xml:space="preserve">Effect Plot for Empathy: Empathic concern in the judgments_victim. The panels show predicted judgments on the observed -9 to 9 scale with 95% confidence intervals.</w:t>
       </w:r>
     </w:p>
     <w:p>
@@ -2872,19 +2774,25 @@
         <w:pStyle w:val="BodyText"/>
       </w:pPr>
       <w:r>
-        <w:t xml:space="preserve">Empathy x judged negotiator control label hidden is statistically significant in:</w:t>
-      </w:r>
-      <w:r>
-        <w:t xml:space="preserve"> </w:t>
-      </w:r>
-      <w:r>
-        <w:t xml:space="preserve">- H3: Empathy x judged-status moderation Model A (Tobit)</w:t>
-      </w:r>
-      <w:r>
-        <w:t xml:space="preserve"> </w:t>
-      </w:r>
-      <w:r>
-        <w:t xml:space="preserve">The figure below shows that the predicted relationship rises most sharply for Empathy composite (average) when the condition is Judged negotiator ingroup.</w:t>
+        <w:t xml:space="preserve">Socioeconomic status is statistically significant in:</w:t>
+      </w:r>
+      <w:r>
+        <w:t xml:space="preserve"> </w:t>
+      </w:r>
+      <w:r>
+        <w:t xml:space="preserve">- H2: Negotiator-side relational structure Model A (Tobit)</w:t>
+      </w:r>
+      <w:r>
+        <w:t xml:space="preserve"> </w:t>
+      </w:r>
+      <w:r>
+        <w:t xml:space="preserve">- H2: Negotiator-side relational structure Model B (Tobit)</w:t>
+      </w:r>
+      <w:r>
+        <w:t xml:space="preserve"> </w:t>
+      </w:r>
+      <w:r>
+        <w:t xml:space="preserve">The figure below shows that predicted judgment is higher for Socioeconomic status 5 than for Socioeconomic status 0.</w:t>
       </w:r>
     </w:p>
     <w:p>
@@ -2896,18 +2804,18 @@
           <wp:inline>
             <wp:extent cx="5334000" cy="4000500"/>
             <wp:effectExtent b="0" l="0" r="0" t="0"/>
-            <wp:docPr descr="Interaction Plot for Empathy x judged negotiator control label hidden in the judgments_victim. The panels show predicted judgments on the observed -9 to 9 scale with 95% confidence intervals." title="" id="106" name="Picture"/>
+            <wp:docPr descr="Grouped Prediction Plot for Socioeconomic status in the judgments_victim. The panels show predicted judgments on the observed -9 to 9 scale with 95% confidence intervals." title="" id="107" name="Picture"/>
             <a:graphic>
               <a:graphicData uri="http://schemas.openxmlformats.org/drawingml/2006/picture">
                 <pic:pic>
                   <pic:nvPicPr>
-                    <pic:cNvPr descr="../figures/figure_sig_all_judgments_victim_iri_total_judged_control_judgments_victim_empathy_x_judged_negotiator_control_label_hidden.png" id="107" name="Picture"/>
+                    <pic:cNvPr descr="../figures/figure_sig_all_judgments_victim_economic_status_judgments_victim_socioeconomic_status.png" id="108" name="Picture"/>
                     <pic:cNvPicPr>
                       <a:picLocks noChangeArrowheads="1" noChangeAspect="1"/>
                     </pic:cNvPicPr>
                   </pic:nvPicPr>
                   <pic:blipFill>
-                    <a:blip r:embed="rId105"/>
+                    <a:blip r:embed="rId106"/>
                     <a:stretch>
                       <a:fillRect/>
                     </a:stretch>
@@ -2939,7 +2847,7 @@
         <w:pStyle w:val="ImageCaption"/>
       </w:pPr>
       <w:r>
-        <w:t xml:space="preserve">Interaction Plot for Empathy x judged negotiator control label hidden in the judgments_victim. The panels show predicted judgments on the observed -9 to 9 scale with 95% confidence intervals.</w:t>
+        <w:t xml:space="preserve">Grouped Prediction Plot for Socioeconomic status in the judgments_victim. The panels show predicted judgments on the observed -9 to 9 scale with 95% confidence intervals.</w:t>
       </w:r>
     </w:p>
     <w:p>
@@ -2947,7 +2855,7 @@
         <w:pStyle w:val="BodyText"/>
       </w:pPr>
       <w:r>
-        <w:t xml:space="preserve">Judged negotiator control label hidden (ref = ingroup) is statistically significant in:</w:t>
+        <w:t xml:space="preserve">Judged negotiator outgroup (ref = ingroup) is statistically significant in:</w:t>
       </w:r>
       <w:r>
         <w:t xml:space="preserve"> </w:t>
@@ -2959,7 +2867,13 @@
         <w:t xml:space="preserve"> </w:t>
       </w:r>
       <w:r>
-        <w:t xml:space="preserve">The figure below shows that predicted judgment is higher for Judged negotiator control label hidden than for Judged negotiator ingroup.</w:t>
+        <w:t xml:space="preserve">- H3: Empathy x judged-status moderation Model A (Tobit)</w:t>
+      </w:r>
+      <w:r>
+        <w:t xml:space="preserve"> </w:t>
+      </w:r>
+      <w:r>
+        <w:t xml:space="preserve">The figure below shows that predicted judgment is higher for Judged negotiator outgroup than for Judged negotiator ingroup.</w:t>
       </w:r>
     </w:p>
     <w:p>
@@ -2971,18 +2885,18 @@
           <wp:inline>
             <wp:extent cx="5334000" cy="4000500"/>
             <wp:effectExtent b="0" l="0" r="0" t="0"/>
-            <wp:docPr descr="Grouped Prediction Plot for Judged negotiator control label hidden (ref = ingroup) in the judgments_victim. The panels show predicted judgments on the observed -9 to 9 scale with 95% confidence intervals." title="" id="109" name="Picture"/>
+            <wp:docPr descr="Grouped Prediction Plot for Judged negotiator outgroup (ref = ingroup) in the judgments_victim. The panels show predicted judgments on the observed -9 to 9 scale with 95% confidence intervals." title="" id="110" name="Picture"/>
             <a:graphic>
               <a:graphicData uri="http://schemas.openxmlformats.org/drawingml/2006/picture">
                 <pic:pic>
                   <pic:nvPicPr>
-                    <pic:cNvPr descr="../figures/figure_sig_all_judgments_victim_judged_control_judgments_victim_judged_negotiator_control_label_hidden_ref_ingroup.png" id="110" name="Picture"/>
+                    <pic:cNvPr descr="../figures/figure_sig_all_judgments_victim_judged_outgroup_judgments_victim_judged_negotiator_outgroup_ref_ingroup.png" id="111" name="Picture"/>
                     <pic:cNvPicPr>
                       <a:picLocks noChangeArrowheads="1" noChangeAspect="1"/>
                     </pic:cNvPicPr>
                   </pic:nvPicPr>
                   <pic:blipFill>
-                    <a:blip r:embed="rId108"/>
+                    <a:blip r:embed="rId109"/>
                     <a:stretch>
                       <a:fillRect/>
                     </a:stretch>
@@ -3014,12 +2928,729 @@
         <w:pStyle w:val="ImageCaption"/>
       </w:pPr>
       <w:r>
+        <w:t xml:space="preserve">Grouped Prediction Plot for Judged negotiator outgroup (ref = ingroup) in the judgments_victim. The panels show predicted judgments on the observed -9 to 9 scale with 95% confidence intervals.</w:t>
+      </w:r>
+    </w:p>
+    <w:p>
+      <w:pPr>
+        <w:pStyle w:val="BodyText"/>
+      </w:pPr>
+      <w:r>
+        <w:t xml:space="preserve">Personal distress x judged negotiator outgroup is statistically significant in:</w:t>
+      </w:r>
+      <w:r>
+        <w:t xml:space="preserve"> </w:t>
+      </w:r>
+      <w:r>
+        <w:t xml:space="preserve">- H3: Empathy x judged-status moderation Model B (Tobit)</w:t>
+      </w:r>
+      <w:r>
+        <w:t xml:space="preserve"> </w:t>
+      </w:r>
+      <w:r>
+        <w:t xml:space="preserve">The figure below shows that the predicted relationship rises most sharply for Empathy: Personal distress when the condition is Judged negotiator outgroup.</w:t>
+      </w:r>
+    </w:p>
+    <w:p>
+      <w:pPr>
+        <w:pStyle w:val="CaptionedFigure"/>
+      </w:pPr>
+      <w:r>
+        <w:drawing>
+          <wp:inline>
+            <wp:extent cx="5334000" cy="4000500"/>
+            <wp:effectExtent b="0" l="0" r="0" t="0"/>
+            <wp:docPr descr="Interaction Plot for Personal distress x judged negotiator outgroup in the judgments_victim. The panels show predicted judgments on the observed -9 to 9 scale with 95% confidence intervals." title="" id="113" name="Picture"/>
+            <a:graphic>
+              <a:graphicData uri="http://schemas.openxmlformats.org/drawingml/2006/picture">
+                <pic:pic>
+                  <pic:nvPicPr>
+                    <pic:cNvPr descr="../figures/figure_sig_all_judgments_victim_iri_pd_judged_outgroup_judgments_victim_personal_distress_x_judged_negotiator_outgroup.png" id="114" name="Picture"/>
+                    <pic:cNvPicPr>
+                      <a:picLocks noChangeArrowheads="1" noChangeAspect="1"/>
+                    </pic:cNvPicPr>
+                  </pic:nvPicPr>
+                  <pic:blipFill>
+                    <a:blip r:embed="rId112"/>
+                    <a:stretch>
+                      <a:fillRect/>
+                    </a:stretch>
+                  </pic:blipFill>
+                  <pic:spPr bwMode="auto">
+                    <a:xfrm>
+                      <a:off x="0" y="0"/>
+                      <a:ext cx="5334000" cy="4000500"/>
+                    </a:xfrm>
+                    <a:prstGeom prst="rect">
+                      <a:avLst/>
+                    </a:prstGeom>
+                    <a:noFill/>
+                    <a:ln w="9525">
+                      <a:noFill/>
+                      <a:headEnd/>
+                      <a:tailEnd/>
+                    </a:ln>
+                  </pic:spPr>
+                </pic:pic>
+              </a:graphicData>
+            </a:graphic>
+          </wp:inline>
+        </w:drawing>
+      </w:r>
+    </w:p>
+    <w:p>
+      <w:pPr>
+        <w:pStyle w:val="ImageCaption"/>
+      </w:pPr>
+      <w:r>
+        <w:t xml:space="preserve">Interaction Plot for Personal distress x judged negotiator outgroup in the judgments_victim. The panels show predicted judgments on the observed -9 to 9 scale with 95% confidence intervals.</w:t>
+      </w:r>
+    </w:p>
+    <w:p>
+      <w:pPr>
+        <w:pStyle w:val="BodyText"/>
+      </w:pPr>
+      <w:r>
+        <w:t xml:space="preserve">Empathic concern x judged negotiator outgroup is statistically significant in:</w:t>
+      </w:r>
+      <w:r>
+        <w:t xml:space="preserve"> </w:t>
+      </w:r>
+      <w:r>
+        <w:t xml:space="preserve">- H3: Empathy x judged-status moderation Model B (Tobit)</w:t>
+      </w:r>
+      <w:r>
+        <w:t xml:space="preserve"> </w:t>
+      </w:r>
+      <w:r>
+        <w:t xml:space="preserve">The figure below shows that the predicted relationship falls most sharply for Empathy: Empathic concern when the condition is Judged negotiator outgroup.</w:t>
+      </w:r>
+    </w:p>
+    <w:p>
+      <w:pPr>
+        <w:pStyle w:val="CaptionedFigure"/>
+      </w:pPr>
+      <w:r>
+        <w:drawing>
+          <wp:inline>
+            <wp:extent cx="5334000" cy="4000500"/>
+            <wp:effectExtent b="0" l="0" r="0" t="0"/>
+            <wp:docPr descr="Interaction Plot for Empathic concern x judged negotiator outgroup in the judgments_victim. The panels show predicted judgments on the observed -9 to 9 scale with 95% confidence intervals." title="" id="116" name="Picture"/>
+            <a:graphic>
+              <a:graphicData uri="http://schemas.openxmlformats.org/drawingml/2006/picture">
+                <pic:pic>
+                  <pic:nvPicPr>
+                    <pic:cNvPr descr="../figures/figure_sig_all_judgments_victim_iri_ec_judged_outgroup_judgments_victim_empathic_concern_x_judged_negotiator_outgroup.png" id="117" name="Picture"/>
+                    <pic:cNvPicPr>
+                      <a:picLocks noChangeArrowheads="1" noChangeAspect="1"/>
+                    </pic:cNvPicPr>
+                  </pic:nvPicPr>
+                  <pic:blipFill>
+                    <a:blip r:embed="rId115"/>
+                    <a:stretch>
+                      <a:fillRect/>
+                    </a:stretch>
+                  </pic:blipFill>
+                  <pic:spPr bwMode="auto">
+                    <a:xfrm>
+                      <a:off x="0" y="0"/>
+                      <a:ext cx="5334000" cy="4000500"/>
+                    </a:xfrm>
+                    <a:prstGeom prst="rect">
+                      <a:avLst/>
+                    </a:prstGeom>
+                    <a:noFill/>
+                    <a:ln w="9525">
+                      <a:noFill/>
+                      <a:headEnd/>
+                      <a:tailEnd/>
+                    </a:ln>
+                  </pic:spPr>
+                </pic:pic>
+              </a:graphicData>
+            </a:graphic>
+          </wp:inline>
+        </w:drawing>
+      </w:r>
+    </w:p>
+    <w:p>
+      <w:pPr>
+        <w:pStyle w:val="ImageCaption"/>
+      </w:pPr>
+      <w:r>
+        <w:t xml:space="preserve">Interaction Plot for Empathic concern x judged negotiator outgroup in the judgments_victim. The panels show predicted judgments on the observed -9 to 9 scale with 95% confidence intervals.</w:t>
+      </w:r>
+    </w:p>
+    <w:p>
+      <w:pPr>
+        <w:pStyle w:val="BodyText"/>
+      </w:pPr>
+      <w:r>
+        <w:t xml:space="preserve">Engineering participant (ref = humanities) is statistically significant in:</w:t>
+      </w:r>
+      <w:r>
+        <w:t xml:space="preserve"> </w:t>
+      </w:r>
+      <w:r>
+        <w:t xml:space="preserve">- H3: Empathy x judged-status moderation Model A (Tobit)</w:t>
+      </w:r>
+      <w:r>
+        <w:t xml:space="preserve"> </w:t>
+      </w:r>
+      <w:r>
+        <w:t xml:space="preserve">- H1: Empathy under relational controls Model A (Tobit)</w:t>
+      </w:r>
+      <w:r>
+        <w:t xml:space="preserve"> </w:t>
+      </w:r>
+      <w:r>
+        <w:t xml:space="preserve">- H3: Empathy x judged-status moderation Model B (Tobit)</w:t>
+      </w:r>
+      <w:r>
+        <w:t xml:space="preserve"> </w:t>
+      </w:r>
+      <w:r>
+        <w:t xml:space="preserve">- H1: Empathy under relational controls Model B (Tobit)</w:t>
+      </w:r>
+      <w:r>
+        <w:t xml:space="preserve"> </w:t>
+      </w:r>
+      <w:r>
+        <w:t xml:space="preserve">- H2: Negotiator-side relational structure Model B (Tobit)</w:t>
+      </w:r>
+      <w:r>
+        <w:t xml:space="preserve"> </w:t>
+      </w:r>
+      <w:r>
+        <w:t xml:space="preserve">- H2: Negotiator-side relational structure Model A (Tobit)</w:t>
+      </w:r>
+      <w:r>
+        <w:t xml:space="preserve"> </w:t>
+      </w:r>
+      <w:r>
+        <w:t xml:space="preserve">The figure below shows that predicted judgment is higher for Engineering participant than for Humanities participant.</w:t>
+      </w:r>
+    </w:p>
+    <w:p>
+      <w:pPr>
+        <w:pStyle w:val="CaptionedFigure"/>
+      </w:pPr>
+      <w:r>
+        <w:drawing>
+          <wp:inline>
+            <wp:extent cx="5334000" cy="4000500"/>
+            <wp:effectExtent b="0" l="0" r="0" t="0"/>
+            <wp:docPr descr="Grouped Prediction Plot for Engineering participant (ref = humanities) in the judgments_victim. The panels show predicted judgments on the observed -9 to 9 scale with 95% confidence intervals." title="" id="119" name="Picture"/>
+            <a:graphic>
+              <a:graphicData uri="http://schemas.openxmlformats.org/drawingml/2006/picture">
+                <pic:pic>
+                  <pic:nvPicPr>
+                    <pic:cNvPr descr="../figures/figure_sig_all_judgments_victim_participant_engineering_judgments_victim_engineering_participant_ref_humanities.png" id="120" name="Picture"/>
+                    <pic:cNvPicPr>
+                      <a:picLocks noChangeArrowheads="1" noChangeAspect="1"/>
+                    </pic:cNvPicPr>
+                  </pic:nvPicPr>
+                  <pic:blipFill>
+                    <a:blip r:embed="rId118"/>
+                    <a:stretch>
+                      <a:fillRect/>
+                    </a:stretch>
+                  </pic:blipFill>
+                  <pic:spPr bwMode="auto">
+                    <a:xfrm>
+                      <a:off x="0" y="0"/>
+                      <a:ext cx="5334000" cy="4000500"/>
+                    </a:xfrm>
+                    <a:prstGeom prst="rect">
+                      <a:avLst/>
+                    </a:prstGeom>
+                    <a:noFill/>
+                    <a:ln w="9525">
+                      <a:noFill/>
+                      <a:headEnd/>
+                      <a:tailEnd/>
+                    </a:ln>
+                  </pic:spPr>
+                </pic:pic>
+              </a:graphicData>
+            </a:graphic>
+          </wp:inline>
+        </w:drawing>
+      </w:r>
+    </w:p>
+    <w:p>
+      <w:pPr>
+        <w:pStyle w:val="ImageCaption"/>
+      </w:pPr>
+      <w:r>
+        <w:t xml:space="preserve">Grouped Prediction Plot for Engineering participant (ref = humanities) in the judgments_victim. The panels show predicted judgments on the observed -9 to 9 scale with 95% confidence intervals.</w:t>
+      </w:r>
+    </w:p>
+    <w:p>
+      <w:pPr>
+        <w:pStyle w:val="BodyText"/>
+      </w:pPr>
+      <w:r>
+        <w:t xml:space="preserve">Empathy composite (average) is statistically significant in:</w:t>
+      </w:r>
+      <w:r>
+        <w:t xml:space="preserve"> </w:t>
+      </w:r>
+      <w:r>
+        <w:t xml:space="preserve">- H3: Empathy x judged-status moderation Model A (Tobit)</w:t>
+      </w:r>
+      <w:r>
+        <w:t xml:space="preserve"> </w:t>
+      </w:r>
+      <w:r>
+        <w:t xml:space="preserve">The figure below shows that across the observed range, higher Empathy composite (average) corresponds to higher predicted judgment.</w:t>
+      </w:r>
+    </w:p>
+    <w:p>
+      <w:pPr>
+        <w:pStyle w:val="CaptionedFigure"/>
+      </w:pPr>
+      <w:r>
+        <w:drawing>
+          <wp:inline>
+            <wp:extent cx="5334000" cy="4000500"/>
+            <wp:effectExtent b="0" l="0" r="0" t="0"/>
+            <wp:docPr descr="Effect Plot for Empathy composite (average) in the judgments_victim. The panels show predicted judgments on the observed -9 to 9 scale with 95% confidence intervals." title="" id="122" name="Picture"/>
+            <a:graphic>
+              <a:graphicData uri="http://schemas.openxmlformats.org/drawingml/2006/picture">
+                <pic:pic>
+                  <pic:nvPicPr>
+                    <pic:cNvPr descr="../figures/figure_sig_all_judgments_victim_iri_total_judgments_victim_empathy_composite_average.png" id="123" name="Picture"/>
+                    <pic:cNvPicPr>
+                      <a:picLocks noChangeArrowheads="1" noChangeAspect="1"/>
+                    </pic:cNvPicPr>
+                  </pic:nvPicPr>
+                  <pic:blipFill>
+                    <a:blip r:embed="rId121"/>
+                    <a:stretch>
+                      <a:fillRect/>
+                    </a:stretch>
+                  </pic:blipFill>
+                  <pic:spPr bwMode="auto">
+                    <a:xfrm>
+                      <a:off x="0" y="0"/>
+                      <a:ext cx="5334000" cy="4000500"/>
+                    </a:xfrm>
+                    <a:prstGeom prst="rect">
+                      <a:avLst/>
+                    </a:prstGeom>
+                    <a:noFill/>
+                    <a:ln w="9525">
+                      <a:noFill/>
+                      <a:headEnd/>
+                      <a:tailEnd/>
+                    </a:ln>
+                  </pic:spPr>
+                </pic:pic>
+              </a:graphicData>
+            </a:graphic>
+          </wp:inline>
+        </w:drawing>
+      </w:r>
+    </w:p>
+    <w:p>
+      <w:pPr>
+        <w:pStyle w:val="ImageCaption"/>
+      </w:pPr>
+      <w:r>
+        <w:t xml:space="preserve">Effect Plot for Empathy composite (average) in the judgments_victim. The panels show predicted judgments on the observed -9 to 9 scale with 95% confidence intervals.</w:t>
+      </w:r>
+    </w:p>
+    <w:p>
+      <w:pPr>
+        <w:pStyle w:val="BodyText"/>
+      </w:pPr>
+      <w:r>
+        <w:t xml:space="preserve">Empathy: Personal distress is statistically significant in:</w:t>
+      </w:r>
+      <w:r>
+        <w:t xml:space="preserve"> </w:t>
+      </w:r>
+      <w:r>
+        <w:t xml:space="preserve">- H2: Negotiator-side relational structure Model B (Tobit)</w:t>
+      </w:r>
+      <w:r>
+        <w:t xml:space="preserve"> </w:t>
+      </w:r>
+      <w:r>
+        <w:t xml:space="preserve">- H1: Empathy under relational controls Model B (Tobit)</w:t>
+      </w:r>
+      <w:r>
+        <w:t xml:space="preserve"> </w:t>
+      </w:r>
+      <w:r>
+        <w:t xml:space="preserve">The figure below shows that across the observed range, higher Empathy: Personal distress corresponds to higher predicted judgment.</w:t>
+      </w:r>
+    </w:p>
+    <w:p>
+      <w:pPr>
+        <w:pStyle w:val="CaptionedFigure"/>
+      </w:pPr>
+      <w:r>
+        <w:drawing>
+          <wp:inline>
+            <wp:extent cx="5334000" cy="4000500"/>
+            <wp:effectExtent b="0" l="0" r="0" t="0"/>
+            <wp:docPr descr="Effect Plot for Empathy: Personal distress in the judgments_victim. The panels show predicted judgments on the observed -9 to 9 scale with 95% confidence intervals." title="" id="125" name="Picture"/>
+            <a:graphic>
+              <a:graphicData uri="http://schemas.openxmlformats.org/drawingml/2006/picture">
+                <pic:pic>
+                  <pic:nvPicPr>
+                    <pic:cNvPr descr="../figures/figure_sig_all_judgments_victim_iri_pd_judgments_victim_empathy_personal_distress.png" id="126" name="Picture"/>
+                    <pic:cNvPicPr>
+                      <a:picLocks noChangeArrowheads="1" noChangeAspect="1"/>
+                    </pic:cNvPicPr>
+                  </pic:nvPicPr>
+                  <pic:blipFill>
+                    <a:blip r:embed="rId124"/>
+                    <a:stretch>
+                      <a:fillRect/>
+                    </a:stretch>
+                  </pic:blipFill>
+                  <pic:spPr bwMode="auto">
+                    <a:xfrm>
+                      <a:off x="0" y="0"/>
+                      <a:ext cx="5334000" cy="4000500"/>
+                    </a:xfrm>
+                    <a:prstGeom prst="rect">
+                      <a:avLst/>
+                    </a:prstGeom>
+                    <a:noFill/>
+                    <a:ln w="9525">
+                      <a:noFill/>
+                      <a:headEnd/>
+                      <a:tailEnd/>
+                    </a:ln>
+                  </pic:spPr>
+                </pic:pic>
+              </a:graphicData>
+            </a:graphic>
+          </wp:inline>
+        </w:drawing>
+      </w:r>
+    </w:p>
+    <w:p>
+      <w:pPr>
+        <w:pStyle w:val="ImageCaption"/>
+      </w:pPr>
+      <w:r>
+        <w:t xml:space="preserve">Effect Plot for Empathy: Personal distress in the judgments_victim. The panels show predicted judgments on the observed -9 to 9 scale with 95% confidence intervals.</w:t>
+      </w:r>
+    </w:p>
+    <w:p>
+      <w:pPr>
+        <w:pStyle w:val="BodyText"/>
+      </w:pPr>
+      <w:r>
+        <w:t xml:space="preserve">Empathy x judged negotiator outgroup is statistically significant in:</w:t>
+      </w:r>
+      <w:r>
+        <w:t xml:space="preserve"> </w:t>
+      </w:r>
+      <w:r>
+        <w:t xml:space="preserve">- H3: Empathy x judged-status moderation Model A (Tobit)</w:t>
+      </w:r>
+      <w:r>
+        <w:t xml:space="preserve"> </w:t>
+      </w:r>
+      <w:r>
+        <w:t xml:space="preserve">The figure below shows that the predicted relationship rises most sharply for Empathy composite (average) when the condition is Judged negotiator ingroup.</w:t>
+      </w:r>
+    </w:p>
+    <w:p>
+      <w:pPr>
+        <w:pStyle w:val="CaptionedFigure"/>
+      </w:pPr>
+      <w:r>
+        <w:drawing>
+          <wp:inline>
+            <wp:extent cx="5334000" cy="4000500"/>
+            <wp:effectExtent b="0" l="0" r="0" t="0"/>
+            <wp:docPr descr="Interaction Plot for Empathy x judged negotiator outgroup in the judgments_victim. The panels show predicted judgments on the observed -9 to 9 scale with 95% confidence intervals." title="" id="128" name="Picture"/>
+            <a:graphic>
+              <a:graphicData uri="http://schemas.openxmlformats.org/drawingml/2006/picture">
+                <pic:pic>
+                  <pic:nvPicPr>
+                    <pic:cNvPr descr="../figures/figure_sig_all_judgments_victim_iri_total_judged_outgroup_judgments_victim_empathy_x_judged_negotiator_outgroup.png" id="129" name="Picture"/>
+                    <pic:cNvPicPr>
+                      <a:picLocks noChangeArrowheads="1" noChangeAspect="1"/>
+                    </pic:cNvPicPr>
+                  </pic:nvPicPr>
+                  <pic:blipFill>
+                    <a:blip r:embed="rId127"/>
+                    <a:stretch>
+                      <a:fillRect/>
+                    </a:stretch>
+                  </pic:blipFill>
+                  <pic:spPr bwMode="auto">
+                    <a:xfrm>
+                      <a:off x="0" y="0"/>
+                      <a:ext cx="5334000" cy="4000500"/>
+                    </a:xfrm>
+                    <a:prstGeom prst="rect">
+                      <a:avLst/>
+                    </a:prstGeom>
+                    <a:noFill/>
+                    <a:ln w="9525">
+                      <a:noFill/>
+                      <a:headEnd/>
+                      <a:tailEnd/>
+                    </a:ln>
+                  </pic:spPr>
+                </pic:pic>
+              </a:graphicData>
+            </a:graphic>
+          </wp:inline>
+        </w:drawing>
+      </w:r>
+    </w:p>
+    <w:p>
+      <w:pPr>
+        <w:pStyle w:val="ImageCaption"/>
+      </w:pPr>
+      <w:r>
+        <w:t xml:space="preserve">Interaction Plot for Empathy x judged negotiator outgroup in the judgments_victim. The panels show predicted judgments on the observed -9 to 9 scale with 95% confidence intervals.</w:t>
+      </w:r>
+    </w:p>
+    <w:p>
+      <w:pPr>
+        <w:pStyle w:val="BodyText"/>
+      </w:pPr>
+      <w:r>
+        <w:t xml:space="preserve">Age is statistically significant in:</w:t>
+      </w:r>
+      <w:r>
+        <w:t xml:space="preserve"> </w:t>
+      </w:r>
+      <w:r>
+        <w:t xml:space="preserve">- H3: Empathy x judged-status moderation Model A (Tobit)</w:t>
+      </w:r>
+      <w:r>
+        <w:t xml:space="preserve"> </w:t>
+      </w:r>
+      <w:r>
+        <w:t xml:space="preserve">- H1: Empathy under relational controls Model A (Tobit)</w:t>
+      </w:r>
+      <w:r>
+        <w:t xml:space="preserve"> </w:t>
+      </w:r>
+      <w:r>
+        <w:t xml:space="preserve">The figure below shows that across the observed range, higher Age corresponds to higher predicted judgment.</w:t>
+      </w:r>
+    </w:p>
+    <w:p>
+      <w:pPr>
+        <w:pStyle w:val="CaptionedFigure"/>
+      </w:pPr>
+      <w:r>
+        <w:drawing>
+          <wp:inline>
+            <wp:extent cx="5334000" cy="4000500"/>
+            <wp:effectExtent b="0" l="0" r="0" t="0"/>
+            <wp:docPr descr="Effect Plot for Age in the judgments_victim. The panels show predicted judgments on the observed -9 to 9 scale with 95% confidence intervals." title="" id="131" name="Picture"/>
+            <a:graphic>
+              <a:graphicData uri="http://schemas.openxmlformats.org/drawingml/2006/picture">
+                <pic:pic>
+                  <pic:nvPicPr>
+                    <pic:cNvPr descr="../figures/figure_sig_all_judgments_victim_age_judgments_victim_age.png" id="132" name="Picture"/>
+                    <pic:cNvPicPr>
+                      <a:picLocks noChangeArrowheads="1" noChangeAspect="1"/>
+                    </pic:cNvPicPr>
+                  </pic:nvPicPr>
+                  <pic:blipFill>
+                    <a:blip r:embed="rId130"/>
+                    <a:stretch>
+                      <a:fillRect/>
+                    </a:stretch>
+                  </pic:blipFill>
+                  <pic:spPr bwMode="auto">
+                    <a:xfrm>
+                      <a:off x="0" y="0"/>
+                      <a:ext cx="5334000" cy="4000500"/>
+                    </a:xfrm>
+                    <a:prstGeom prst="rect">
+                      <a:avLst/>
+                    </a:prstGeom>
+                    <a:noFill/>
+                    <a:ln w="9525">
+                      <a:noFill/>
+                      <a:headEnd/>
+                      <a:tailEnd/>
+                    </a:ln>
+                  </pic:spPr>
+                </pic:pic>
+              </a:graphicData>
+            </a:graphic>
+          </wp:inline>
+        </w:drawing>
+      </w:r>
+    </w:p>
+    <w:p>
+      <w:pPr>
+        <w:pStyle w:val="ImageCaption"/>
+      </w:pPr>
+      <w:r>
+        <w:t xml:space="preserve">Effect Plot for Age in the judgments_victim. The panels show predicted judgments on the observed -9 to 9 scale with 95% confidence intervals.</w:t>
+      </w:r>
+    </w:p>
+    <w:p>
+      <w:pPr>
+        <w:pStyle w:val="BodyText"/>
+      </w:pPr>
+      <w:r>
+        <w:t xml:space="preserve">Empathy x judged negotiator control label hidden is statistically significant in:</w:t>
+      </w:r>
+      <w:r>
+        <w:t xml:space="preserve"> </w:t>
+      </w:r>
+      <w:r>
+        <w:t xml:space="preserve">- H3: Empathy x judged-status moderation Model A (Tobit)</w:t>
+      </w:r>
+      <w:r>
+        <w:t xml:space="preserve"> </w:t>
+      </w:r>
+      <w:r>
+        <w:t xml:space="preserve">The figure below shows that the predicted relationship rises most sharply for Empathy composite (average) when the condition is Judged negotiator ingroup.</w:t>
+      </w:r>
+    </w:p>
+    <w:p>
+      <w:pPr>
+        <w:pStyle w:val="CaptionedFigure"/>
+      </w:pPr>
+      <w:r>
+        <w:drawing>
+          <wp:inline>
+            <wp:extent cx="5334000" cy="4000500"/>
+            <wp:effectExtent b="0" l="0" r="0" t="0"/>
+            <wp:docPr descr="Interaction Plot for Empathy x judged negotiator control label hidden in the judgments_victim. The panels show predicted judgments on the observed -9 to 9 scale with 95% confidence intervals." title="" id="134" name="Picture"/>
+            <a:graphic>
+              <a:graphicData uri="http://schemas.openxmlformats.org/drawingml/2006/picture">
+                <pic:pic>
+                  <pic:nvPicPr>
+                    <pic:cNvPr descr="../figures/figure_sig_all_judgments_victim_iri_total_judged_control_judgments_victim_empathy_x_judged_negotiator_control_label_hidden.png" id="135" name="Picture"/>
+                    <pic:cNvPicPr>
+                      <a:picLocks noChangeArrowheads="1" noChangeAspect="1"/>
+                    </pic:cNvPicPr>
+                  </pic:nvPicPr>
+                  <pic:blipFill>
+                    <a:blip r:embed="rId133"/>
+                    <a:stretch>
+                      <a:fillRect/>
+                    </a:stretch>
+                  </pic:blipFill>
+                  <pic:spPr bwMode="auto">
+                    <a:xfrm>
+                      <a:off x="0" y="0"/>
+                      <a:ext cx="5334000" cy="4000500"/>
+                    </a:xfrm>
+                    <a:prstGeom prst="rect">
+                      <a:avLst/>
+                    </a:prstGeom>
+                    <a:noFill/>
+                    <a:ln w="9525">
+                      <a:noFill/>
+                      <a:headEnd/>
+                      <a:tailEnd/>
+                    </a:ln>
+                  </pic:spPr>
+                </pic:pic>
+              </a:graphicData>
+            </a:graphic>
+          </wp:inline>
+        </w:drawing>
+      </w:r>
+    </w:p>
+    <w:p>
+      <w:pPr>
+        <w:pStyle w:val="ImageCaption"/>
+      </w:pPr>
+      <w:r>
+        <w:t xml:space="preserve">Interaction Plot for Empathy x judged negotiator control label hidden in the judgments_victim. The panels show predicted judgments on the observed -9 to 9 scale with 95% confidence intervals.</w:t>
+      </w:r>
+    </w:p>
+    <w:p>
+      <w:pPr>
+        <w:pStyle w:val="BodyText"/>
+      </w:pPr>
+      <w:r>
+        <w:t xml:space="preserve">Judged negotiator control label hidden (ref = ingroup) is statistically significant in:</w:t>
+      </w:r>
+      <w:r>
+        <w:t xml:space="preserve"> </w:t>
+      </w:r>
+      <w:r>
+        <w:t xml:space="preserve">- H3: Empathy x judged-status moderation Model B (Tobit)</w:t>
+      </w:r>
+      <w:r>
+        <w:t xml:space="preserve"> </w:t>
+      </w:r>
+      <w:r>
+        <w:t xml:space="preserve">The figure below shows that predicted judgment is higher for Judged negotiator control label hidden than for Judged negotiator ingroup.</w:t>
+      </w:r>
+    </w:p>
+    <w:p>
+      <w:pPr>
+        <w:pStyle w:val="CaptionedFigure"/>
+      </w:pPr>
+      <w:r>
+        <w:drawing>
+          <wp:inline>
+            <wp:extent cx="5334000" cy="4000500"/>
+            <wp:effectExtent b="0" l="0" r="0" t="0"/>
+            <wp:docPr descr="Grouped Prediction Plot for Judged negotiator control label hidden (ref = ingroup) in the judgments_victim. The panels show predicted judgments on the observed -9 to 9 scale with 95% confidence intervals." title="" id="137" name="Picture"/>
+            <a:graphic>
+              <a:graphicData uri="http://schemas.openxmlformats.org/drawingml/2006/picture">
+                <pic:pic>
+                  <pic:nvPicPr>
+                    <pic:cNvPr descr="../figures/figure_sig_all_judgments_victim_judged_control_judgments_victim_judged_negotiator_control_label_hidden_ref_ingroup.png" id="138" name="Picture"/>
+                    <pic:cNvPicPr>
+                      <a:picLocks noChangeArrowheads="1" noChangeAspect="1"/>
+                    </pic:cNvPicPr>
+                  </pic:nvPicPr>
+                  <pic:blipFill>
+                    <a:blip r:embed="rId136"/>
+                    <a:stretch>
+                      <a:fillRect/>
+                    </a:stretch>
+                  </pic:blipFill>
+                  <pic:spPr bwMode="auto">
+                    <a:xfrm>
+                      <a:off x="0" y="0"/>
+                      <a:ext cx="5334000" cy="4000500"/>
+                    </a:xfrm>
+                    <a:prstGeom prst="rect">
+                      <a:avLst/>
+                    </a:prstGeom>
+                    <a:noFill/>
+                    <a:ln w="9525">
+                      <a:noFill/>
+                      <a:headEnd/>
+                      <a:tailEnd/>
+                    </a:ln>
+                  </pic:spPr>
+                </pic:pic>
+              </a:graphicData>
+            </a:graphic>
+          </wp:inline>
+        </w:drawing>
+      </w:r>
+    </w:p>
+    <w:p>
+      <w:pPr>
+        <w:pStyle w:val="ImageCaption"/>
+      </w:pPr>
+      <w:r>
         <w:t xml:space="preserve">Grouped Prediction Plot for Judged negotiator control label hidden (ref = ingroup) in the judgments_victim. The panels show predicted judgments on the observed -9 to 9 scale with 95% confidence intervals.</w:t>
       </w:r>
     </w:p>
-    <w:bookmarkEnd w:id="111"/>
-    <w:bookmarkEnd w:id="112"/>
-    <w:bookmarkStart w:id="113" w:name="hypothesis-conclusion-summary"/>
+    <w:bookmarkEnd w:id="139"/>
+    <w:bookmarkEnd w:id="140"/>
+    <w:bookmarkStart w:id="141" w:name="hypothesis-conclusion-summary"/>
     <w:p>
       <w:pPr>
         <w:pStyle w:val="Heading2"/>
@@ -3045,13 +3676,7 @@
         <w:t xml:space="preserve"> </w:t>
       </w:r>
       <w:r>
-        <w:t xml:space="preserve">- H2a. Original hypothesis: Moral-judgment severity should vary with the judged negotiator’s ingroup-versus-outgroup status, and that relational effect should depend on whether the harmful deal was accepted or rejected. Victim subset: Tobit conclusion: the available models do not support the hypothesis. Model A does not support the hypothesis; none of the judged-negotiator relational-status terms and their decision interaction in the non-control sample are statistically significant, and the closest signal is Accepted harmful deal x judged negotiator outgroup with a positive association (p = 0.457). Model B does not support the hypothesis; none of the judged-negotiator relational-status terms and their decision interaction in the non-control sample are statistically significant, and the closest signal is Accepted harmful deal x judged negotiator outgroup with a positive association (p = 0.631). Additional statistically significant signals include Negotiator accepted harmful deal with a negative association (p &lt; 0.001) and Empathy: Perspective taking with a positive association (p = 0.018). Bystander subset: Tobit conclusion: the available models do not support the hypothesis. Model A does not support the hypothesis; none of the judged-negotiator relational-status terms and their decision interaction in the non-control sample are statistically significant, and the closest signal is Accepted harmful deal x judged negotiator outgroup with a negative association (p = 0.804). Model B does not support the hypothesis; none of the judged-negotiator relational-status terms and their decision interaction in the non-control sample are statistically significant, and the closest signal is Accepted harmful deal x judged negotiator outgroup with a negative association (p = 0.769). Additional statistically significant signals include Negotiator accepted harmful deal with a negative association (p &lt; 0.001) and Socioeconomic status with a positive association (p = 0.011).</w:t>
-      </w:r>
-      <w:r>
-        <w:t xml:space="preserve"> </w:t>
-      </w:r>
-      <w:r>
-        <w:t xml:space="preserve">- H2b. Original hypothesis: Moral-judgment severity should vary with the judged negotiator’s ingroup-versus-outgroup-versus-control status, and that relational effect should depend on whether the harmful deal was accepted or rejected. Victim subset: Tobit conclusion: the available models do not support the hypothesis. Model A does not support the hypothesis; none of the judged-negotiator relational-status terms and their decision interaction in the full sample are statistically significant, and the closest signal is Accepted harmful deal x judged negotiator control label hidden with a positive association (p = 0.407). Model B does not support the hypothesis; none of the judged-negotiator relational-status terms and their decision interaction in the full sample are statistically significant, and the closest signal is Accepted harmful deal x judged negotiator control label hidden with a positive association (p = 0.447). Additional statistically significant signals include Negotiator accepted harmful deal with a negative association (p &lt; 0.001) and Empathy: Perspective taking with a positive association (p = 0.003). Bystander subset: Tobit conclusion: the available models do not support the hypothesis. Model A does not support the hypothesis; none of the judged-negotiator relational-status terms and their decision interaction in the full sample are statistically significant, and the closest signal is Accepted harmful deal x judged negotiator outgroup with a negative association (p = 0.489). Model B does not support the hypothesis; none of the judged-negotiator relational-status terms and their decision interaction in the full sample are statistically significant, and the closest signal is Accepted harmful deal x judged negotiator outgroup with a negative association (p = 0.433). Additional statistically significant signals include Negotiator accepted harmful deal with a negative association (p &lt; 0.001) and Engineering participant (ref = humanities) with a positive association (p = 0.016).</w:t>
+        <w:t xml:space="preserve">- H2. Original hypothesis: Moral-judgment severity should vary with the judgment-level ingroup/outgroup/control structure of the judged and counterpart negotiators. In the bystander subset, that negotiator-side structure should further depend on whether the player and the victim share faculty or not. Victim subset: Tobit conclusion: the available models do not support the hypothesis. Model A does not support the hypothesis; none of the negotiator-side ingroup/outgroup/control structure dummies in the victim subset are statistically significant, and the closest signal is Negotiator-side structure: judged negotiator control label hidden, counterpart negotiator ingroup (ref = judged negotiator ingroup, counterpart negotiator ingroup) with a negative association (p = 0.319). Model B does not support the hypothesis; none of the negotiator-side ingroup/outgroup/control structure dummies in the victim subset are statistically significant, and the closest signal is Negotiator-side structure: judged negotiator control label hidden, counterpart negotiator ingroup (ref = judged negotiator ingroup, counterpart negotiator ingroup) with a negative association (p = 0.298). Additional statistically significant signals include Empathy: Perspective taking with a positive association (p &lt; 0.001) and Empathy: Empathic concern with a negative association (p = 0.003). Bystander subset: Tobit conclusion: the available models support the hypothesis. Model A supports the hypothesis through Negotiator-side structure: judged negotiator ingroup, counterpart negotiator outgroup (ref = judged negotiator ingroup, counterpart negotiator ingroup) x Player-victim outgroup (ref = ingroup victim) with a positive association (p = 0.035). Model B supports the hypothesis through Negotiator-side structure: judged negotiator ingroup, counterpart negotiator outgroup (ref = judged negotiator ingroup, counterpart negotiator ingroup) x Player-victim outgroup (ref = ingroup victim) with a positive association (p = 0.030). Additional statistically significant signals include Socioeconomic status with a positive association (p = 0.012) and Empathy: Empathic concern with a negative association (p = 0.028).</w:t>
       </w:r>
       <w:r>
         <w:t xml:space="preserve"> </w:t>
@@ -3060,8 +3685,8 @@
         <w:t xml:space="preserve">- H3. Original hypothesis: The empathy effect may vary according to whether the judged negotiator is ingroup, outgroup, or control, while decision outcome and the additional relational controls remain explicitly modeled. Victim subset: Tobit conclusion: the available models support the hypothesis. Model A supports the hypothesis through Empathy x judged negotiator outgroup with a negative association (p = 0.050). Model B supports the hypothesis through Personal distress x judged negotiator outgroup with a positive association (p = 0.026) and Empathic concern x judged negotiator outgroup with a negative association (p = 0.026). Additional statistically significant signals include Negotiator accepted harmful deal with a negative association (p &lt; 0.001) and Empathy: Perspective taking with a positive association (p = 0.008). Bystander subset: Tobit conclusion: the available models support the hypothesis. Model A supports the hypothesis through Empathy x judged negotiator control label hidden with a positive association (p = 0.007). Model B supports the hypothesis through Personal distress x judged negotiator outgroup with a positive association (p = 0.016). Additional statistically significant signals include Negotiator accepted harmful deal with a negative association (p &lt; 0.001) and Judged negotiator control label hidden (ref = ingroup) with a negative association (p = 0.013).</w:t>
       </w:r>
     </w:p>
-    <w:bookmarkEnd w:id="113"/>
-    <w:bookmarkStart w:id="114" w:name="pdf-comprehensive-report-generated"/>
+    <w:bookmarkEnd w:id="141"/>
+    <w:bookmarkStart w:id="142" w:name="pdf-comprehensive-report-generated"/>
     <w:p>
       <w:pPr>
         <w:pStyle w:val="Heading2"/>
@@ -3123,8 +3748,8 @@
         <w:t xml:space="preserve">is also refreshed.</w:t>
       </w:r>
     </w:p>
-    <w:bookmarkEnd w:id="114"/>
-    <w:bookmarkEnd w:id="115"/>
+    <w:bookmarkEnd w:id="142"/>
+    <w:bookmarkEnd w:id="143"/>
     <w:sectPr>
       <w:footnotePr>
         <w:numRestart w:val="eachSect"/>

</xml_diff>